<commit_message>
Update the AI prompt, guide and skill for v1.2
The liquidity window replaces the deal count as the thing that decides timing, so
the prompt now asks for a window in fund-years and tells the model that a
coupon-payer is a fund unless the user says it is a single company. The deal
count keeps its one remaining job, which is the venture outcome table at 20+.

Co-Authored-By: Claude Opus 5 <noreply@anthropic.com>
</commit_message>
<xml_diff>
--- a/resources/Exit_Timing_Calendar_System_Prompt_and_Guide.docx
+++ b/resources/Exit_Timing_Calendar_System_Prompt_and_Guide.docx
@@ -34,7 +34,7 @@
           <w:color w:val="5B6A7C"/>
           <w:sz w:val="21"/>
         </w:rPr>
-        <w:t>v1.1  ·  24 September 2026</w:t>
+        <w:t>v1.2  ·  24 September 2026</w:t>
       </w:r>
     </w:p>
     <w:p>
@@ -63,6 +63,107 @@
           <w:sz w:val="22"/>
         </w:rPr>
         <w:t>You do not need this document to use the tool. The web version at https://jocelynrenaud-commits.github.io/exit-timing-calendar/ does the same thing with no setup at all, and your spreadsheet never leaves your machine. This is here for anyone who would rather run the method inside the AI tool they already use, or wants to look under the hood and argue with the assumptions.</w:t>
+      </w:r>
+    </w:p>
+    <w:p>
+      <w:pPr>
+        <w:spacing w:before="320" w:after="120"/>
+      </w:pPr>
+      <w:r>
+        <w:rPr>
+          <w:b/>
+          <w:color w:val="1F3864"/>
+          <w:sz w:val="32"/>
+        </w:rPr>
+        <w:t>What changed in v1.2</w:t>
+      </w:r>
+    </w:p>
+    <w:p>
+      <w:pPr>
+        <w:spacing w:after="160"/>
+      </w:pPr>
+      <w:r>
+        <w:rPr>
+          <w:b w:val="0"/>
+          <w:i w:val="0"/>
+          <w:color w:val="141A22"/>
+          <w:sz w:val="22"/>
+        </w:rPr>
+        <w:t>A fund now pays out over a window without you having to count its deals. In v1.1 you had to tell the tool how many investments a fund held before it would spread the payout, and that was the wrong question: whether a fund sells down over time has nothing to do with how many things are inside it. It is simply what funds do.</w:t>
+      </w:r>
+    </w:p>
+    <w:p>
+      <w:pPr>
+        <w:spacing w:after="160"/>
+      </w:pPr>
+      <w:r>
+        <w:rPr>
+          <w:b/>
+          <w:i w:val="0"/>
+          <w:color w:val="141A22"/>
+          <w:sz w:val="22"/>
+        </w:rPr>
+        <w:t>Anything paying a preferred return or a coupon is now treated as a fund</w:t>
+      </w:r>
+      <w:r>
+        <w:rPr>
+          <w:b w:val="0"/>
+          <w:i w:val="0"/>
+          <w:color w:val="141A22"/>
+          <w:sz w:val="22"/>
+        </w:rPr>
+        <w:t xml:space="preserve"> and pays out over a window, with nothing to fill in. If you hold a single company that pays a preferred return, put 1 in the Deals in fund column and it will exit on one date instead, which is what happens when a company is bought.</w:t>
+      </w:r>
+    </w:p>
+    <w:p>
+      <w:pPr>
+        <w:spacing w:after="160"/>
+      </w:pPr>
+      <w:r>
+        <w:rPr>
+          <w:b/>
+          <w:i w:val="0"/>
+          <w:color w:val="141A22"/>
+          <w:sz w:val="22"/>
+        </w:rPr>
+        <w:t>Two new optional columns, Liquidity from and Liquidity to</w:t>
+      </w:r>
+      <w:r>
+        <w:rPr>
+          <w:b w:val="0"/>
+          <w:i w:val="0"/>
+          <w:color w:val="141A22"/>
+          <w:sz w:val="22"/>
+        </w:rPr>
+        <w:t>, counted in years from when you funded the deal. If a sponsor has told you to expect distributions in years five through eight, put 5 and 8 and that is exactly what gets used. Left blank, the sell-down runs over the back 40% of the hold.</w:t>
+      </w:r>
+    </w:p>
+    <w:p>
+      <w:pPr>
+        <w:spacing w:after="160"/>
+      </w:pPr>
+      <w:r>
+        <w:rPr>
+          <w:b w:val="0"/>
+          <w:i w:val="0"/>
+          <w:color w:val="141A22"/>
+          <w:sz w:val="22"/>
+        </w:rPr>
+        <w:t>Worth knowing: a fund’s pay-out window and its stated life are not the same thing. A property fund can finish selling in year six and formally wind up in year seven, which is why the window is its own input rather than being read off the term.</w:t>
+      </w:r>
+    </w:p>
+    <w:p>
+      <w:pPr>
+        <w:spacing w:after="160"/>
+      </w:pPr>
+      <w:r>
+        <w:rPr>
+          <w:b w:val="0"/>
+          <w:i w:val="0"/>
+          <w:color w:val="141A22"/>
+          <w:sz w:val="22"/>
+        </w:rPr>
+        <w:t>The deal count still matters for one thing: a venture fund holding 20 or more companies is priced differently from a single company. That has not changed.</w:t>
       </w:r>
     </w:p>
     <w:p>
@@ -1249,7 +1350,7 @@
           <w:color w:val="141A22"/>
           <w:sz w:val="17"/>
         </w:rPr>
-        <w:t>So ask for a deal count on every position. If the user cannot say, assume 1 and tell</w:t>
+        <w:t>So ask for a deal count on VENTURE positions. It decides the outcome table and nothing</w:t>
       </w:r>
     </w:p>
     <w:p>
@@ -1262,7 +1363,7 @@
           <w:color w:val="141A22"/>
           <w:sz w:val="17"/>
         </w:rPr>
-        <w:t>them you did, because assuming diversification nobody declared is inventing it.</w:t>
+        <w:t>else. If the user cannot say, assume 1 and tell them you did, because assuming</w:t>
       </w:r>
     </w:p>
     <w:p>
@@ -1275,7 +1376,7 @@
           <w:color w:val="141A22"/>
           <w:sz w:val="17"/>
         </w:rPr>
-        <w:t xml:space="preserve">    1 deal            Use STEP 3 unchanged.</w:t>
+        <w:t>diversification nobody declared is inventing it.</w:t>
       </w:r>
     </w:p>
     <w:p>
@@ -1288,7 +1389,7 @@
           <w:color w:val="141A22"/>
           <w:sz w:val="17"/>
         </w:rPr>
-        <w:t xml:space="preserve">    2 to 19 deals     Use STEP 3 for the outcome, but stage the timing (STEP 4a).</w:t>
+        <w:t xml:space="preserve">    fewer than 20     Use STEP 3 unchanged.</w:t>
       </w:r>
     </w:p>
     <w:p>
@@ -1301,7 +1402,7 @@
           <w:color w:val="141A22"/>
           <w:sz w:val="17"/>
         </w:rPr>
-        <w:t xml:space="preserve">    20 or more        Use the FUND TABLE below, and stage the timing.</w:t>
+        <w:t xml:space="preserve">    20 or more        Use the FUND TABLE below.</w:t>
       </w:r>
     </w:p>
     <w:p>
@@ -1818,7 +1919,7 @@
           <w:color w:val="141A22"/>
           <w:sz w:val="17"/>
         </w:rPr>
-        <w:t>Any position holding more than one deal pays out across a window rather than in a</w:t>
+        <w:t>This is a separate question from the deal count, and do not confuse the two. Whether a</w:t>
       </w:r>
     </w:p>
     <w:p>
@@ -1831,7 +1932,7 @@
           <w:color w:val="141A22"/>
           <w:sz w:val="17"/>
         </w:rPr>
-        <w:t>single year. Dropping a fund's whole proceeds into one year is the larger error on a</w:t>
+        <w:t>position pays out over years has nothing to do with how many companies are inside it;</w:t>
       </w:r>
     </w:p>
     <w:p>
@@ -1844,7 +1945,7 @@
           <w:color w:val="141A22"/>
           <w:sz w:val="17"/>
         </w:rPr>
-        <w:t>calendar, because the calendar is the point. Offsets are from the drawn exit year:</w:t>
+        <w:t>it is simply what a fund does. Dropping a fund's whole proceeds into one year is the</w:t>
       </w:r>
     </w:p>
     <w:p>
@@ -1857,7 +1958,7 @@
           <w:color w:val="141A22"/>
           <w:sz w:val="17"/>
         </w:rPr>
-        <w:t xml:space="preserve">    VENTURE FUND   -3: 10%   -2: 15%   -1: 20%   0: 25%   +1: 18%   +2: 12%</w:t>
+        <w:t>larger error on a calendar, because the calendar is the point.</w:t>
       </w:r>
     </w:p>
     <w:p>
@@ -1870,7 +1971,6 @@
           <w:color w:val="141A22"/>
           <w:sz w:val="17"/>
         </w:rPr>
-        <w:t xml:space="preserve">    INCOME FUND    -2: 15%   -1: 25%    0: 35%  +1: 25%</w:t>
       </w:r>
     </w:p>
     <w:p>
@@ -1883,7 +1983,7 @@
           <w:color w:val="141A22"/>
           <w:sz w:val="17"/>
         </w:rPr>
-        <w:t>The weights sum to 1, so this MOVES money between years and never creates or destroys</w:t>
+        <w:t>ASK FOR A LIQUIDITY WINDOW, in years from funding: the years over which the vehicle</w:t>
       </w:r>
     </w:p>
     <w:p>
@@ -1896,7 +1996,7 @@
           <w:color w:val="141A22"/>
           <w:sz w:val="17"/>
         </w:rPr>
-        <w:t>any. Check that: your lifetime totals must be identical with and without staging. If</w:t>
+        <w:t>actually sells down and pays out. Sponsors state this and users often already know it,</w:t>
       </w:r>
     </w:p>
     <w:p>
@@ -1909,7 +2009,7 @@
           <w:color w:val="141A22"/>
           <w:sz w:val="17"/>
         </w:rPr>
-        <w:t>part of the window falls outside the years you are reporting, renormalise the weights</w:t>
+        <w:t>for example "distributions expected in years five through eight".</w:t>
       </w:r>
     </w:p>
     <w:p>
@@ -1922,7 +2022,7 @@
           <w:color w:val="141A22"/>
           <w:sz w:val="17"/>
         </w:rPr>
-        <w:t>over the years that remain rather than dropping that slice, or you will silently</w:t>
+        <w:t xml:space="preserve">    A COUPON-PAYING POSITION IS A FUND unless the user says it is a single company.</w:t>
       </w:r>
     </w:p>
     <w:p>
@@ -1935,7 +2035,7 @@
           <w:color w:val="141A22"/>
           <w:sz w:val="17"/>
         </w:rPr>
-        <w:t>delete cash.</w:t>
+        <w:t xml:space="preserve">    Most coupon-paying vehicles are funds. One company paying a preferred return is</w:t>
       </w:r>
     </w:p>
     <w:p>
@@ -1948,7 +2048,7 @@
           <w:color w:val="141A22"/>
           <w:sz w:val="17"/>
         </w:rPr>
-        <w:t>A single-company position does NOT get this. If a company is bought, the whole company</w:t>
+        <w:t xml:space="preserve">    the exception, and it exits on ONE date, because if it is bought the whole thing is</w:t>
       </w:r>
     </w:p>
     <w:p>
@@ -1961,7 +2061,188 @@
           <w:color w:val="141A22"/>
           <w:sz w:val="17"/>
         </w:rPr>
-        <w:t>is bought on one date.</w:t>
+        <w:t xml:space="preserve">    bought at once.</w:t>
+      </w:r>
+    </w:p>
+    <w:p>
+      <w:pPr>
+        <w:spacing w:after="0" w:line="240" w:lineRule="auto"/>
+      </w:pPr>
+      <w:r>
+        <w:rPr>
+          <w:rFonts w:ascii="Consolas" w:hAnsi="Consolas"/>
+          <w:color w:val="141A22"/>
+          <w:sz w:val="17"/>
+        </w:rPr>
+        <w:t xml:space="preserve">    A VENTURE POSITION IS A SINGLE DEAL unless the user says otherwise.</w:t>
+      </w:r>
+    </w:p>
+    <w:p>
+      <w:pPr>
+        <w:spacing w:after="0" w:line="240" w:lineRule="auto"/>
+      </w:pPr>
+      <w:r>
+        <w:rPr>
+          <w:rFonts w:ascii="Consolas" w:hAnsi="Consolas"/>
+          <w:color w:val="141A22"/>
+          <w:sz w:val="17"/>
+        </w:rPr>
+        <w:t xml:space="preserve">    WITH NO WINDOW STATED, use the back 40% of the hold: from round(hold x 0.6) to the</w:t>
+      </w:r>
+    </w:p>
+    <w:p>
+      <w:pPr>
+        <w:spacing w:after="0" w:line="240" w:lineRule="auto"/>
+      </w:pPr>
+      <w:r>
+        <w:rPr>
+          <w:rFonts w:ascii="Consolas" w:hAnsi="Consolas"/>
+          <w:color w:val="141A22"/>
+          <w:sz w:val="17"/>
+        </w:rPr>
+        <w:t xml:space="preserve">    hold itself, and to hold + 2 for a venture fund, which sells down past its term.</w:t>
+      </w:r>
+    </w:p>
+    <w:p>
+      <w:pPr>
+        <w:spacing w:after="0" w:line="240" w:lineRule="auto"/>
+      </w:pPr>
+      <w:r>
+        <w:rPr>
+          <w:rFonts w:ascii="Consolas" w:hAnsi="Consolas"/>
+          <w:color w:val="141A22"/>
+          <w:sz w:val="17"/>
+        </w:rPr>
+        <w:t>A PAY-OUT WINDOW AND A FUND'S STATED LIFE ARE DIFFERENT THINGS. A property fund can</w:t>
+      </w:r>
+    </w:p>
+    <w:p>
+      <w:pPr>
+        <w:spacing w:after="0" w:line="240" w:lineRule="auto"/>
+      </w:pPr>
+      <w:r>
+        <w:rPr>
+          <w:rFonts w:ascii="Consolas" w:hAnsi="Consolas"/>
+          <w:color w:val="141A22"/>
+          <w:sz w:val="17"/>
+        </w:rPr>
+        <w:t>finish selling in year six and formally wind up in year seven. Do not assume the window</w:t>
+      </w:r>
+    </w:p>
+    <w:p>
+      <w:pPr>
+        <w:spacing w:after="0" w:line="240" w:lineRule="auto"/>
+      </w:pPr>
+      <w:r>
+        <w:rPr>
+          <w:rFonts w:ascii="Consolas" w:hAnsi="Consolas"/>
+          <w:color w:val="141A22"/>
+          <w:sz w:val="17"/>
+        </w:rPr>
+        <w:t>ends at the term.</w:t>
+      </w:r>
+    </w:p>
+    <w:p>
+      <w:pPr>
+        <w:spacing w:after="0" w:line="240" w:lineRule="auto"/>
+      </w:pPr>
+      <w:r>
+        <w:rPr>
+          <w:rFonts w:ascii="Consolas" w:hAnsi="Consolas"/>
+          <w:color w:val="141A22"/>
+          <w:sz w:val="17"/>
+        </w:rPr>
+      </w:r>
+    </w:p>
+    <w:p>
+      <w:pPr>
+        <w:spacing w:after="0" w:line="240" w:lineRule="auto"/>
+      </w:pPr>
+      <w:r>
+        <w:rPr>
+          <w:rFonts w:ascii="Consolas" w:hAnsi="Consolas"/>
+          <w:color w:val="141A22"/>
+          <w:sz w:val="17"/>
+        </w:rPr>
+        <w:t>WEIGHT THE WINDOW so it ramps up: a sell-down starts slowly and the largest payment is</w:t>
+      </w:r>
+    </w:p>
+    <w:p>
+      <w:pPr>
+        <w:spacing w:after="0" w:line="240" w:lineRule="auto"/>
+      </w:pPr>
+      <w:r>
+        <w:rPr>
+          <w:rFonts w:ascii="Consolas" w:hAnsi="Consolas"/>
+          <w:color w:val="141A22"/>
+          <w:sz w:val="17"/>
+        </w:rPr>
+        <w:t>usually the last. For an n-year window use weights proportional to 2, 3, ... n+1.</w:t>
+      </w:r>
+    </w:p>
+    <w:p>
+      <w:pPr>
+        <w:spacing w:after="0" w:line="240" w:lineRule="auto"/>
+      </w:pPr>
+      <w:r>
+        <w:rPr>
+          <w:rFonts w:ascii="Consolas" w:hAnsi="Consolas"/>
+          <w:color w:val="141A22"/>
+          <w:sz w:val="17"/>
+        </w:rPr>
+        <w:t>The weights must sum to 1, so this MOVES money between years and never creates or</w:t>
+      </w:r>
+    </w:p>
+    <w:p>
+      <w:pPr>
+        <w:spacing w:after="0" w:line="240" w:lineRule="auto"/>
+      </w:pPr>
+      <w:r>
+        <w:rPr>
+          <w:rFonts w:ascii="Consolas" w:hAnsi="Consolas"/>
+          <w:color w:val="141A22"/>
+          <w:sz w:val="17"/>
+        </w:rPr>
+        <w:t>destroys any. Check that: your lifetime totals must be identical with and without</w:t>
+      </w:r>
+    </w:p>
+    <w:p>
+      <w:pPr>
+        <w:spacing w:after="0" w:line="240" w:lineRule="auto"/>
+      </w:pPr>
+      <w:r>
+        <w:rPr>
+          <w:rFonts w:ascii="Consolas" w:hAnsi="Consolas"/>
+          <w:color w:val="141A22"/>
+          <w:sz w:val="17"/>
+        </w:rPr>
+        <w:t>staging. If part of the window falls outside the years you are reporting, renormalise</w:t>
+      </w:r>
+    </w:p>
+    <w:p>
+      <w:pPr>
+        <w:spacing w:after="0" w:line="240" w:lineRule="auto"/>
+      </w:pPr>
+      <w:r>
+        <w:rPr>
+          <w:rFonts w:ascii="Consolas" w:hAnsi="Consolas"/>
+          <w:color w:val="141A22"/>
+          <w:sz w:val="17"/>
+        </w:rPr>
+        <w:t>over the years that remain rather than dropping that slice, or you will silently delete</w:t>
+      </w:r>
+    </w:p>
+    <w:p>
+      <w:pPr>
+        <w:spacing w:after="0" w:line="240" w:lineRule="auto"/>
+      </w:pPr>
+      <w:r>
+        <w:rPr>
+          <w:rFonts w:ascii="Consolas" w:hAnsi="Consolas"/>
+          <w:color w:val="141A22"/>
+          <w:sz w:val="17"/>
+        </w:rPr>
+        <w:t>cash.</w:t>
       </w:r>
     </w:p>
     <w:p>
@@ -2721,7 +3002,7 @@
           <w:color w:val="141A22"/>
           <w:sz w:val="17"/>
         </w:rPr>
-        <w:t xml:space="preserve">     UNDERLYING DEALS, exit window, branch probabilities, and a SOURCE column on every</w:t>
+        <w:t xml:space="preserve">     UNDERLYING DEALS, LIQUIDITY WINDOW, exit window, branch probabilities, and a SOURCE</w:t>
       </w:r>
     </w:p>
     <w:p>
@@ -2734,7 +3015,7 @@
           <w:color w:val="141A22"/>
           <w:sz w:val="17"/>
         </w:rPr>
-        <w:t xml:space="preserve">     number: sponsor / document / user estimate. Provenance is not decoration; those are different</w:t>
+        <w:t xml:space="preserve">     column on every number: sponsor / document / user estimate. Provenance is not decoration; those are different</w:t>
       </w:r>
     </w:p>
     <w:p>

</xml_diff>

<commit_message>
AI package v1.3: catches the prompt up with thirteen app versions
Adds the three spreadsheet-parsing rules from v1.8, fund-or-single as an explicit input,
share-class resolution from the commitment, labelling a multiple nobody supplied, the cone,
and IRR - the last mainly to forbid averaging per-deal IRRs into a portfolio figure, which
is a 17.8-point error in the flattering direction.

Co-Authored-By: Claude Opus 5 <noreply@anthropic.com>
</commit_message>
<xml_diff>
--- a/resources/Exit_Timing_Calendar_System_Prompt_and_Guide.docx
+++ b/resources/Exit_Timing_Calendar_System_Prompt_and_Guide.docx
@@ -12,7 +12,7 @@
           <w:color w:val="1F3864"/>
           <w:sz w:val="56"/>
         </w:rPr>
-        <w:t>Exit Timing Calendar</w:t>
+        <w:t>Private Deals</w:t>
       </w:r>
     </w:p>
     <w:p>
@@ -24,7 +24,7 @@
           <w:color w:val="5B6A7C"/>
           <w:sz w:val="30"/>
         </w:rPr>
-        <w:t>AI system prompt, and how to use it</w:t>
+        <w:t>AI system prompt, and how to use it · formerly the Exit Timing Calendar</w:t>
       </w:r>
     </w:p>
     <w:p>
@@ -34,7 +34,7 @@
           <w:color w:val="5B6A7C"/>
           <w:sz w:val="21"/>
         </w:rPr>
-        <w:t>v1.2  ·  24 September 2026</w:t>
+        <w:t>v1.3  ·  26 September 2026</w:t>
       </w:r>
     </w:p>
     <w:p>
@@ -63,6 +63,290 @@
           <w:sz w:val="22"/>
         </w:rPr>
         <w:t>You do not need this document to use the tool. The web version at https://jocelynrenaud-commits.github.io/exit-timing-calendar/ does the same thing with no setup at all, and your spreadsheet never leaves your machine. This is here for anyone who would rather run the method inside the AI tool they already use, or wants to look under the hood and argue with the assumptions.</w:t>
+      </w:r>
+    </w:p>
+    <w:p>
+      <w:pPr>
+        <w:spacing w:before="320" w:after="120"/>
+      </w:pPr>
+      <w:r>
+        <w:rPr>
+          <w:b/>
+          <w:color w:val="1F3864"/>
+          <w:sz w:val="32"/>
+        </w:rPr>
+        <w:t xml:space="preserve">What changed in v1.3</w:t>
+      </w:r>
+    </w:p>
+    <w:p>
+      <w:pPr>
+        <w:spacing w:after="160"/>
+      </w:pPr>
+      <w:r>
+        <w:rPr>
+          <w:b w:val="0"/>
+          <w:i w:val="0"/>
+          <w:color w:val="141A22"/>
+          <w:sz w:val="22"/>
+        </w:rPr>
+        <w:t xml:space="preserve">This is a bigger jump than the version number suggests: the web tool moved from v1.2 to v1.16 while this document sat still, so everything below is new since you last used it. The tool is also now called Private Deals rather than the Exit Timing Calendar. Same site, same method, more of it.</w:t>
+      </w:r>
+    </w:p>
+    <w:p>
+      <w:pPr>
+        <w:spacing w:before="320" w:after="120"/>
+      </w:pPr>
+      <w:r>
+        <w:rPr>
+          <w:b/>
+          <w:color w:val="1F3864"/>
+          <w:sz w:val="32"/>
+        </w:rPr>
+        <w:t xml:space="preserve">Three bugs in how a spreadsheet gets READ, and you will hit all three.</w:t>
+      </w:r>
+    </w:p>
+    <w:p>
+      <w:pPr>
+        <w:spacing w:after="160"/>
+      </w:pPr>
+      <w:r>
+        <w:rPr>
+          <w:b w:val="0"/>
+          <w:i w:val="0"/>
+          <w:color w:val="141A22"/>
+          <w:sz w:val="22"/>
+        </w:rPr>
+        <w:t xml:space="preserve">These are the most valuable lines in the update for anyone handing a tracker to an AI, because they are failures of parsing rather than of modelling, and none of them look wrong on screen. A coupon typed as the text "8%" was read as 800%, which quietly turned an income sleeve into the best position in the book. A column headed "Type" holding "Real Estate" was taken as the vehicle and the asset class was left blank, so the people worst affected were the ones who had been using the tool longest. And a column headed "Funded year" was matched as "Funded" and read as an AMOUNT, so a year of 2026 became $2,026 paid in and the position showed a six-figure uncalled balance that did not exist.</w:t>
+      </w:r>
+    </w:p>
+    <w:p>
+      <w:pPr>
+        <w:spacing w:before="320" w:after="120"/>
+      </w:pPr>
+      <w:r>
+        <w:rPr>
+          <w:b/>
+          <w:color w:val="1F3864"/>
+          <w:sz w:val="32"/>
+        </w:rPr>
+        <w:t xml:space="preserve">Fund or Single deal is now something you say, not something inferred.</w:t>
+      </w:r>
+    </w:p>
+    <w:p>
+      <w:pPr>
+        <w:spacing w:after="160"/>
+      </w:pPr>
+      <w:r>
+        <w:rPr>
+          <w:b w:val="0"/>
+          <w:i w:val="0"/>
+          <w:color w:val="141A22"/>
+          <w:sz w:val="22"/>
+        </w:rPr>
+        <w:t xml:space="preserve">Asking for a deal count and working it out was indirect. Anyone who knows their position is a fund should be able to write "Fund". A stated value beats every inference. The count still decides pricing for a venture fund at twenty or more holdings; it no longer decides whether the payout is staged.</w:t>
+      </w:r>
+    </w:p>
+    <w:p>
+      <w:pPr>
+        <w:spacing w:before="320" w:after="120"/>
+      </w:pPr>
+      <w:r>
+        <w:rPr>
+          <w:b/>
+          <w:color w:val="1F3864"/>
+          <w:sz w:val="32"/>
+        </w:rPr>
+        <w:t xml:space="preserve">A multiple nobody gave you is now flagged instead of being passed off.</w:t>
+      </w:r>
+    </w:p>
+    <w:p>
+      <w:pPr>
+        <w:spacing w:after="160"/>
+      </w:pPr>
+      <w:r>
+        <w:rPr>
+          <w:b w:val="0"/>
+          <w:i w:val="0"/>
+          <w:color w:val="141A22"/>
+          <w:sz w:val="22"/>
+        </w:rPr>
+        <w:t xml:space="preserve">A venture position with no multiple and no coupon used to fall back to 5.0x in silence, and 5.0x is not a neutral number, it is a strong claim. One deal in this book is sold on multiple expansion and produces no sponsor base case at all, so anyone loading it got a confident 5.0x that no human had ever said. The fallback stays, because the model needs a number, but it is now labelled as the tool’s convention rather than anybody’s projection.</w:t>
+      </w:r>
+    </w:p>
+    <w:p>
+      <w:pPr>
+        <w:spacing w:before="320" w:after="120"/>
+      </w:pPr>
+      <w:r>
+        <w:rPr>
+          <w:b/>
+          <w:color w:val="1F3864"/>
+          <w:sz w:val="32"/>
+        </w:rPr>
+        <w:t xml:space="preserve">Where a sponsor prices by ticket size, your class comes from your commitment.</w:t>
+      </w:r>
+    </w:p>
+    <w:p>
+      <w:pPr>
+        <w:spacing w:after="160"/>
+      </w:pPr>
+      <w:r>
+        <w:rPr>
+          <w:b w:val="0"/>
+          <w:i w:val="0"/>
+          <w:color w:val="141A22"/>
+          <w:sz w:val="22"/>
+        </w:rPr>
+        <w:t xml:space="preserve">Several funds have share classes with different preferred rates by cheque size. The tool now picks your band from what you committed instead of telling you to work it out yourself, and says which band it used.</w:t>
+      </w:r>
+    </w:p>
+    <w:p>
+      <w:pPr>
+        <w:spacing w:before="320" w:after="120"/>
+      </w:pPr>
+      <w:r>
+        <w:rPr>
+          <w:b/>
+          <w:color w:val="1F3864"/>
+          <w:sz w:val="32"/>
+        </w:rPr>
+        <w:t xml:space="preserve">The cone of outcomes.</w:t>
+      </w:r>
+    </w:p>
+    <w:p>
+      <w:pPr>
+        <w:spacing w:after="160"/>
+      </w:pPr>
+      <w:r>
+        <w:rPr>
+          <w:b w:val="0"/>
+          <w:i w:val="0"/>
+          <w:color w:val="141A22"/>
+          <w:sz w:val="22"/>
+        </w:rPr>
+        <w:t xml:space="preserve">A picture of the range rather than a line: the band of cumulative outcomes widening year by year, with a dashed line at getting your money back. Every year the band spends below that line is time spent underwater. It is the same shape a J-curve draws, arrived at from the deal terms rather than from a curve.</w:t>
+      </w:r>
+    </w:p>
+    <w:p>
+      <w:pPr>
+        <w:spacing w:before="320" w:after="120"/>
+      </w:pPr>
+      <w:r>
+        <w:rPr>
+          <w:b/>
+          <w:color w:val="1F3864"/>
+          <w:sz w:val="32"/>
+        </w:rPr>
+        <w:t xml:space="preserve">IRR, by deal, by asset class and by scenario.</w:t>
+      </w:r>
+    </w:p>
+    <w:p>
+      <w:pPr>
+        <w:spacing w:after="160"/>
+      </w:pPr>
+      <w:r>
+        <w:rPr>
+          <w:b w:val="0"/>
+          <w:i w:val="0"/>
+          <w:color w:val="141A22"/>
+          <w:sz w:val="22"/>
+        </w:rPr>
+        <w:t xml:space="preserve">New, and the one addition with a rule attached that an AI will get wrong by default. A portfolio IRR is NOT the average of its deals’ IRRs — IRR is not additive. You have to pool every position’s cash flow into one stream, solve once, and only then rank. On the example book, averaging the thirteen deals gives a median of minus 5.4% against a correct 12.4%, which is the difference between a healthy book and a loss-making one. The prompt below forbids the shortcut in as many words.</w:t>
+      </w:r>
+    </w:p>
+    <w:p>
+      <w:pPr>
+        <w:spacing w:before="320" w:after="120"/>
+      </w:pPr>
+      <w:r>
+        <w:rPr>
+          <w:b/>
+          <w:color w:val="1F3864"/>
+          <w:sz w:val="32"/>
+        </w:rPr>
+        <w:t xml:space="preserve">And a second thing IRR made visible, which was worth more than the feature.</w:t>
+      </w:r>
+    </w:p>
+    <w:p>
+      <w:pPr>
+        <w:spacing w:after="160"/>
+      </w:pPr>
+      <w:r>
+        <w:rPr>
+          <w:b w:val="0"/>
+          <w:i w:val="0"/>
+          <w:color w:val="141A22"/>
+          <w:sz w:val="22"/>
+        </w:rPr>
+        <w:t xml:space="preserve">A sponsor’s own multiple sits in the top tenth of outcomes, so at the median and even at a good run it never appears. Four deals in this book with sponsor multiples between 5.5x and 14.2x were printing an identical figure, because below the top decile the outcome table is doing all the work. There is now a separate sponsor-case column so the sponsor’s claim and the model’s own view sit side by side and can be argued with.</w:t>
+      </w:r>
+    </w:p>
+    <w:p>
+      <w:pPr>
+        <w:spacing w:before="320" w:after="120"/>
+      </w:pPr>
+      <w:r>
+        <w:rPr>
+          <w:b/>
+          <w:color w:val="1F3864"/>
+          <w:sz w:val="32"/>
+        </w:rPr>
+        <w:t xml:space="preserve">Marked Up MOIC, an optional column.</w:t>
+      </w:r>
+    </w:p>
+    <w:p>
+      <w:pPr>
+        <w:spacing w:after="160"/>
+      </w:pPr>
+      <w:r>
+        <w:rPr>
+          <w:b w:val="0"/>
+          <w:i w:val="0"/>
+          <w:color w:val="141A22"/>
+          <w:sz w:val="22"/>
+        </w:rPr>
+        <w:t xml:space="preserve">If you track valuation increases — your position doubling when a round reprices — you can now record it. It drives a paper track shown BESIDE the cash forecast and never inside it: it moves no cash figure and it never enters the IRR. Blank means nothing changes. The reason it exists is a fair objection: five to seven years is a long time to hold something with no signal at all. The reason it is quarantined is that a private mark is set by the person holding the asset, is rarely revised downward, and a headline round can carry liquidation preferences that leave a common holder well short of the headline multiple.</w:t>
+      </w:r>
+    </w:p>
+    <w:p>
+      <w:pPr>
+        <w:spacing w:before="320" w:after="120"/>
+      </w:pPr>
+      <w:r>
+        <w:rPr>
+          <w:b/>
+          <w:color w:val="1F3864"/>
+          <w:sz w:val="32"/>
+        </w:rPr>
+        <w:t xml:space="preserve">A card now says which figures you typed over the shared terms.</w:t>
+      </w:r>
+    </w:p>
+    <w:p>
+      <w:pPr>
+        <w:spacing w:after="160"/>
+      </w:pPr>
+      <w:r>
+        <w:rPr>
+          <w:b w:val="0"/>
+          <w:i w:val="0"/>
+          <w:color w:val="141A22"/>
+          <w:sz w:val="22"/>
+        </w:rPr>
+        <w:t xml:space="preserve">Deal terms are identical for everyone who bought the deal, so they live in one shared file per deal. Anything you type beats that file and nothing argues with you — which is also a quiet failure mode, because a number typed before a sponsor corrected its terms looks identical to one typed in deliberate disagreement. Both figures are now shown so you can decide which you still believe.</w:t>
+      </w:r>
+    </w:p>
+    <w:p>
+      <w:pPr>
+        <w:spacing w:after="160"/>
+      </w:pPr>
+      <w:r>
+        <w:rPr>
+          <w:b w:val="0"/>
+          <w:i w:val="0"/>
+          <w:color w:val="141A22"/>
+          <w:sz w:val="22"/>
+        </w:rPr>
+        <w:t xml:space="preserve"/>
       </w:r>
     </w:p>
     <w:p>
@@ -859,6 +1143,253 @@
           <w:color w:val="141A22"/>
           <w:sz w:val="17"/>
         </w:rPr>
+        <w:t xml:space="preserve">STEP 0 - READING THE USER'S SHEET. GET THIS WRONG AND NOTHING ELSE MATTERS.</w:t>
+      </w:r>
+    </w:p>
+    <w:p>
+      <w:pPr>
+        <w:spacing w:after="0" w:line="240" w:lineRule="auto"/>
+      </w:pPr>
+      <w:r>
+        <w:rPr>
+          <w:rFonts w:ascii="Consolas" w:hAnsi="Consolas"/>
+          <w:color w:val="141A22"/>
+          <w:sz w:val="17"/>
+        </w:rPr>
+        <w:t xml:space="preserve">Three parsing failures account for every wrong answer this method has produced</w:t>
+      </w:r>
+    </w:p>
+    <w:p>
+      <w:pPr>
+        <w:spacing w:after="0" w:line="240" w:lineRule="auto"/>
+      </w:pPr>
+      <w:r>
+        <w:rPr>
+          <w:rFonts w:ascii="Consolas" w:hAnsi="Consolas"/>
+          <w:color w:val="141A22"/>
+          <w:sz w:val="17"/>
+        </w:rPr>
+        <w:t xml:space="preserve">that</w:t>
+      </w:r>
+    </w:p>
+    <w:p>
+      <w:pPr>
+        <w:spacing w:after="0" w:line="240" w:lineRule="auto"/>
+      </w:pPr>
+      <w:r>
+        <w:rPr>
+          <w:rFonts w:ascii="Consolas" w:hAnsi="Consolas"/>
+          <w:color w:val="141A22"/>
+          <w:sz w:val="17"/>
+        </w:rPr>
+        <w:t xml:space="preserve">was not a modelling choice. None of them look wrong in the output.</w:t>
+      </w:r>
+    </w:p>
+    <w:p>
+      <w:pPr>
+        <w:spacing w:after="0" w:line="240" w:lineRule="auto"/>
+      </w:pPr>
+      <w:r>
+        <w:rPr>
+          <w:rFonts w:ascii="Consolas" w:hAnsi="Consolas"/>
+          <w:color w:val="141A22"/>
+          <w:sz w:val="17"/>
+        </w:rPr>
+        <w:t xml:space="preserve">  A PERCENTAGE TYPED AS TEXT. "8%" as a string is not 0.08. Strip the % and</w:t>
+      </w:r>
+    </w:p>
+    <w:p>
+      <w:pPr>
+        <w:spacing w:after="0" w:line="240" w:lineRule="auto"/>
+      </w:pPr>
+      <w:r>
+        <w:rPr>
+          <w:rFonts w:ascii="Consolas" w:hAnsi="Consolas"/>
+          <w:color w:val="141A22"/>
+          <w:sz w:val="17"/>
+        </w:rPr>
+        <w:t xml:space="preserve">  divide</w:t>
+      </w:r>
+    </w:p>
+    <w:p>
+      <w:pPr>
+        <w:spacing w:after="0" w:line="240" w:lineRule="auto"/>
+      </w:pPr>
+      <w:r>
+        <w:rPr>
+          <w:rFonts w:ascii="Consolas" w:hAnsi="Consolas"/>
+          <w:color w:val="141A22"/>
+          <w:sz w:val="17"/>
+        </w:rPr>
+        <w:t xml:space="preserve">  by 100. Read as 8 it becomes 800%, and an income sleeve silently turns into</w:t>
+      </w:r>
+    </w:p>
+    <w:p>
+      <w:pPr>
+        <w:spacing w:after="0" w:line="240" w:lineRule="auto"/>
+      </w:pPr>
+      <w:r>
+        <w:rPr>
+          <w:rFonts w:ascii="Consolas" w:hAnsi="Consolas"/>
+          <w:color w:val="141A22"/>
+          <w:sz w:val="17"/>
+        </w:rPr>
+        <w:t xml:space="preserve">  the</w:t>
+      </w:r>
+    </w:p>
+    <w:p>
+      <w:pPr>
+        <w:spacing w:after="0" w:line="240" w:lineRule="auto"/>
+      </w:pPr>
+      <w:r>
+        <w:rPr>
+          <w:rFonts w:ascii="Consolas" w:hAnsi="Consolas"/>
+          <w:color w:val="141A22"/>
+          <w:sz w:val="17"/>
+        </w:rPr>
+        <w:t xml:space="preserve">  best position in the book.</w:t>
+      </w:r>
+    </w:p>
+    <w:p>
+      <w:pPr>
+        <w:spacing w:after="0" w:line="240" w:lineRule="auto"/>
+      </w:pPr>
+      <w:r>
+        <w:rPr>
+          <w:rFonts w:ascii="Consolas" w:hAnsi="Consolas"/>
+          <w:color w:val="141A22"/>
+          <w:sz w:val="17"/>
+        </w:rPr>
+        <w:t xml:space="preserve">  A COLUMN HEADED "Type". It usually holds the ASSET CLASS - "Real Estate",</w:t>
+      </w:r>
+    </w:p>
+    <w:p>
+      <w:pPr>
+        <w:spacing w:after="0" w:line="240" w:lineRule="auto"/>
+      </w:pPr>
+      <w:r>
+        <w:rPr>
+          <w:rFonts w:ascii="Consolas" w:hAnsi="Consolas"/>
+          <w:color w:val="141A22"/>
+          <w:sz w:val="17"/>
+        </w:rPr>
+        <w:t xml:space="preserve">  "VC" -</w:t>
+      </w:r>
+    </w:p>
+    <w:p>
+      <w:pPr>
+        <w:spacing w:after="0" w:line="240" w:lineRule="auto"/>
+      </w:pPr>
+      <w:r>
+        <w:rPr>
+          <w:rFonts w:ascii="Consolas" w:hAnsi="Consolas"/>
+          <w:color w:val="141A22"/>
+          <w:sz w:val="17"/>
+        </w:rPr>
+        <w:t xml:space="preserve">  not the vehicle. Do not match it to fund-or-single.</w:t>
+      </w:r>
+    </w:p>
+    <w:p>
+      <w:pPr>
+        <w:spacing w:after="0" w:line="240" w:lineRule="auto"/>
+      </w:pPr>
+      <w:r>
+        <w:rPr>
+          <w:rFonts w:ascii="Consolas" w:hAnsi="Consolas"/>
+          <w:color w:val="141A22"/>
+          <w:sz w:val="17"/>
+        </w:rPr>
+        <w:t xml:space="preserve">  A COLUMN HEADED "Funded year" IS A YEAR, NOT AN AMOUNT. Matching it as</w:t>
+      </w:r>
+    </w:p>
+    <w:p>
+      <w:pPr>
+        <w:spacing w:after="0" w:line="240" w:lineRule="auto"/>
+      </w:pPr>
+      <w:r>
+        <w:rPr>
+          <w:rFonts w:ascii="Consolas" w:hAnsi="Consolas"/>
+          <w:color w:val="141A22"/>
+          <w:sz w:val="17"/>
+        </w:rPr>
+        <w:t xml:space="preserve">  "Funded"</w:t>
+      </w:r>
+    </w:p>
+    <w:p>
+      <w:pPr>
+        <w:spacing w:after="0" w:line="240" w:lineRule="auto"/>
+      </w:pPr>
+      <w:r>
+        <w:rPr>
+          <w:rFonts w:ascii="Consolas" w:hAnsi="Consolas"/>
+          <w:color w:val="141A22"/>
+          <w:sz w:val="17"/>
+        </w:rPr>
+        <w:t xml:space="preserve">  turns 2026 into $2,026 paid in and invents a six-figure uncalled balance.</w:t>
+      </w:r>
+    </w:p>
+    <w:p>
+      <w:pPr>
+        <w:spacing w:after="0" w:line="240" w:lineRule="auto"/>
+      </w:pPr>
+      <w:r>
+        <w:rPr>
+          <w:rFonts w:ascii="Consolas" w:hAnsi="Consolas"/>
+          <w:color w:val="141A22"/>
+          <w:sz w:val="17"/>
+        </w:rPr>
+        <w:t xml:space="preserve">If a header is ambiguous, ASK. Do not guess between a year and an amount.</w:t>
+      </w:r>
+    </w:p>
+    <w:p>
+      <w:pPr>
+        <w:spacing w:after="0" w:line="240" w:lineRule="auto"/>
+      </w:pPr>
+      <w:r>
+        <w:rPr>
+          <w:rFonts w:ascii="Consolas" w:hAnsi="Consolas"/>
+          <w:color w:val="141A22"/>
+          <w:sz w:val="17"/>
+        </w:rPr>
+        <w:t xml:space="preserve">Echo back every column you matched and to which field, before computing</w:t>
+      </w:r>
+    </w:p>
+    <w:p>
+      <w:pPr>
+        <w:spacing w:after="0" w:line="240" w:lineRule="auto"/>
+      </w:pPr>
+      <w:r>
+        <w:rPr>
+          <w:rFonts w:ascii="Consolas" w:hAnsi="Consolas"/>
+          <w:color w:val="141A22"/>
+          <w:sz w:val="17"/>
+        </w:rPr>
+        <w:t xml:space="preserve">anything.</w:t>
+      </w:r>
+    </w:p>
+    <w:p>
+      <w:pPr>
+        <w:spacing w:after="0" w:line="240" w:lineRule="auto"/>
+      </w:pPr>
+      <w:r>
+        <w:rPr>
+          <w:rFonts w:ascii="Consolas" w:hAnsi="Consolas"/>
+          <w:color w:val="141A22"/>
+          <w:sz w:val="17"/>
+        </w:rPr>
+        <w:t xml:space="preserve"/>
+      </w:r>
+    </w:p>
+    <w:p>
+      <w:pPr>
+        <w:spacing w:after="0" w:line="240" w:lineRule="auto"/>
+      </w:pPr>
+      <w:r>
+        <w:rPr>
+          <w:rFonts w:ascii="Consolas" w:hAnsi="Consolas"/>
+          <w:color w:val="141A22"/>
+          <w:sz w:val="17"/>
+        </w:rPr>
         <w:t>STEP 1 - SORT EVERY POSITION BY CASH TYPE. NEVER ADD ACROSS TYPES.</w:t>
       </w:r>
     </w:p>
@@ -1052,6 +1583,214 @@
           <w:color w:val="141A22"/>
           <w:sz w:val="17"/>
         </w:rPr>
+        <w:t xml:space="preserve">RECORDING A MARKUP WITHOUT LETTING IT IN. A user may track marked-up values,</w:t>
+      </w:r>
+    </w:p>
+    <w:p>
+      <w:pPr>
+        <w:spacing w:after="0" w:line="240" w:lineRule="auto"/>
+      </w:pPr>
+      <w:r>
+        <w:rPr>
+          <w:rFonts w:ascii="Consolas" w:hAnsi="Consolas"/>
+          <w:color w:val="141A22"/>
+          <w:sz w:val="17"/>
+        </w:rPr>
+        <w:t xml:space="preserve">and</w:t>
+      </w:r>
+    </w:p>
+    <w:p>
+      <w:pPr>
+        <w:spacing w:after="0" w:line="240" w:lineRule="auto"/>
+      </w:pPr>
+      <w:r>
+        <w:rPr>
+          <w:rFonts w:ascii="Consolas" w:hAnsi="Consolas"/>
+          <w:color w:val="141A22"/>
+          <w:sz w:val="17"/>
+        </w:rPr>
+        <w:t xml:space="preserve">that is legitimate: waiting five to seven years with no signal at all is</w:t>
+      </w:r>
+    </w:p>
+    <w:p>
+      <w:pPr>
+        <w:spacing w:after="0" w:line="240" w:lineRule="auto"/>
+      </w:pPr>
+      <w:r>
+        <w:rPr>
+          <w:rFonts w:ascii="Consolas" w:hAnsi="Consolas"/>
+          <w:color w:val="141A22"/>
+          <w:sz w:val="17"/>
+        </w:rPr>
+        <w:t xml:space="preserve">worse. Take</w:t>
+      </w:r>
+    </w:p>
+    <w:p>
+      <w:pPr>
+        <w:spacing w:after="0" w:line="240" w:lineRule="auto"/>
+      </w:pPr>
+      <w:r>
+        <w:rPr>
+          <w:rFonts w:ascii="Consolas" w:hAnsi="Consolas"/>
+          <w:color w:val="141A22"/>
+          <w:sz w:val="17"/>
+        </w:rPr>
+        <w:t xml:space="preserve">it as a separate "marked up multiple" input, apply it to FUNDED capital rather</w:t>
+      </w:r>
+    </w:p>
+    <w:p>
+      <w:pPr>
+        <w:spacing w:after="0" w:line="240" w:lineRule="auto"/>
+      </w:pPr>
+      <w:r>
+        <w:rPr>
+          <w:rFonts w:ascii="Consolas" w:hAnsi="Consolas"/>
+          <w:color w:val="141A22"/>
+          <w:sz w:val="17"/>
+        </w:rPr>
+        <w:t xml:space="preserve">than</w:t>
+      </w:r>
+    </w:p>
+    <w:p>
+      <w:pPr>
+        <w:spacing w:after="0" w:line="240" w:lineRule="auto"/>
+      </w:pPr>
+      <w:r>
+        <w:rPr>
+          <w:rFonts w:ascii="Consolas" w:hAnsi="Consolas"/>
+          <w:color w:val="141A22"/>
+          <w:sz w:val="17"/>
+        </w:rPr>
+        <w:t xml:space="preserve">to the commitment - there is no paper gain on money not yet sent - and report</w:t>
+      </w:r>
+    </w:p>
+    <w:p>
+      <w:pPr>
+        <w:spacing w:after="0" w:line="240" w:lineRule="auto"/>
+      </w:pPr>
+      <w:r>
+        <w:rPr>
+          <w:rFonts w:ascii="Consolas" w:hAnsi="Consolas"/>
+          <w:color w:val="141A22"/>
+          <w:sz w:val="17"/>
+        </w:rPr>
+        <w:t xml:space="preserve">it in</w:t>
+      </w:r>
+    </w:p>
+    <w:p>
+      <w:pPr>
+        <w:spacing w:after="0" w:line="240" w:lineRule="auto"/>
+      </w:pPr>
+      <w:r>
+        <w:rPr>
+          <w:rFonts w:ascii="Consolas" w:hAnsi="Consolas"/>
+          <w:color w:val="141A22"/>
+          <w:sz w:val="17"/>
+        </w:rPr>
+        <w:t xml:space="preserve">its own paper block, clearly outside every cash table and outside the IRR.</w:t>
+      </w:r>
+    </w:p>
+    <w:p>
+      <w:pPr>
+        <w:spacing w:after="0" w:line="240" w:lineRule="auto"/>
+      </w:pPr>
+      <w:r>
+        <w:rPr>
+          <w:rFonts w:ascii="Consolas" w:hAnsi="Consolas"/>
+          <w:color w:val="141A22"/>
+          <w:sz w:val="17"/>
+        </w:rPr>
+        <w:t xml:space="preserve">Say what it is not: not cash, not spendable, not net worth. A private mark is</w:t>
+      </w:r>
+    </w:p>
+    <w:p>
+      <w:pPr>
+        <w:spacing w:after="0" w:line="240" w:lineRule="auto"/>
+      </w:pPr>
+      <w:r>
+        <w:rPr>
+          <w:rFonts w:ascii="Consolas" w:hAnsi="Consolas"/>
+          <w:color w:val="141A22"/>
+          <w:sz w:val="17"/>
+        </w:rPr>
+        <w:t xml:space="preserve">set by</w:t>
+      </w:r>
+    </w:p>
+    <w:p>
+      <w:pPr>
+        <w:spacing w:after="0" w:line="240" w:lineRule="auto"/>
+      </w:pPr>
+      <w:r>
+        <w:rPr>
+          <w:rFonts w:ascii="Consolas" w:hAnsi="Consolas"/>
+          <w:color w:val="141A22"/>
+          <w:sz w:val="17"/>
+        </w:rPr>
+        <w:t xml:space="preserve">the holder of the asset and is rarely revised downward, and a headline round</w:t>
+      </w:r>
+    </w:p>
+    <w:p>
+      <w:pPr>
+        <w:spacing w:after="0" w:line="240" w:lineRule="auto"/>
+      </w:pPr>
+      <w:r>
+        <w:rPr>
+          <w:rFonts w:ascii="Consolas" w:hAnsi="Consolas"/>
+          <w:color w:val="141A22"/>
+          <w:sz w:val="17"/>
+        </w:rPr>
+        <w:t xml:space="preserve">can</w:t>
+      </w:r>
+    </w:p>
+    <w:p>
+      <w:pPr>
+        <w:spacing w:after="0" w:line="240" w:lineRule="auto"/>
+      </w:pPr>
+      <w:r>
+        <w:rPr>
+          <w:rFonts w:ascii="Consolas" w:hAnsi="Consolas"/>
+          <w:color w:val="141A22"/>
+          <w:sz w:val="17"/>
+        </w:rPr>
+        <w:t xml:space="preserve">carry liquidation preferences that leave a common holder short of the headline</w:t>
+      </w:r>
+    </w:p>
+    <w:p>
+      <w:pPr>
+        <w:spacing w:after="0" w:line="240" w:lineRule="auto"/>
+      </w:pPr>
+      <w:r>
+        <w:rPr>
+          <w:rFonts w:ascii="Consolas" w:hAnsi="Consolas"/>
+          <w:color w:val="141A22"/>
+          <w:sz w:val="17"/>
+        </w:rPr>
+        <w:t xml:space="preserve">multiple.</w:t>
+      </w:r>
+    </w:p>
+    <w:p>
+      <w:pPr>
+        <w:spacing w:after="0" w:line="240" w:lineRule="auto"/>
+      </w:pPr>
+      <w:r>
+        <w:rPr>
+          <w:rFonts w:ascii="Consolas" w:hAnsi="Consolas"/>
+          <w:color w:val="141A22"/>
+          <w:sz w:val="17"/>
+        </w:rPr>
+        <w:t xml:space="preserve"/>
+      </w:r>
+    </w:p>
+    <w:p>
+      <w:pPr>
+        <w:spacing w:after="0" w:line="240" w:lineRule="auto"/>
+      </w:pPr>
+      <w:r>
+        <w:rPr>
+          <w:rFonts w:ascii="Consolas" w:hAnsi="Consolas"/>
+          <w:color w:val="141A22"/>
+          <w:sz w:val="17"/>
+        </w:rPr>
         <w:t>STEP 3 - OUTCOME DISTRIBUTION, NOT A POINT MULTIPLE.</w:t>
       </w:r>
     </w:p>
@@ -1738,6 +2477,136 @@
           <w:color w:val="141A22"/>
           <w:sz w:val="17"/>
         </w:rPr>
+        <w:t xml:space="preserve">STEP 3c - A MULTIPLE NOBODY GAVE YOU MUST BE LABELLED AS YOURS.</w:t>
+      </w:r>
+    </w:p>
+    <w:p>
+      <w:pPr>
+        <w:spacing w:after="0" w:line="240" w:lineRule="auto"/>
+      </w:pPr>
+      <w:r>
+        <w:rPr>
+          <w:rFonts w:ascii="Consolas" w:hAnsi="Consolas"/>
+          <w:color w:val="141A22"/>
+          <w:sz w:val="17"/>
+        </w:rPr>
+        <w:t xml:space="preserve">If a position has no sponsor multiple and no coupon, you still need a number,</w:t>
+      </w:r>
+    </w:p>
+    <w:p>
+      <w:pPr>
+        <w:spacing w:after="0" w:line="240" w:lineRule="auto"/>
+      </w:pPr>
+      <w:r>
+        <w:rPr>
+          <w:rFonts w:ascii="Consolas" w:hAnsi="Consolas"/>
+          <w:color w:val="141A22"/>
+          <w:sz w:val="17"/>
+        </w:rPr>
+        <w:t xml:space="preserve">but a</w:t>
+      </w:r>
+    </w:p>
+    <w:p>
+      <w:pPr>
+        <w:spacing w:after="0" w:line="240" w:lineRule="auto"/>
+      </w:pPr>
+      <w:r>
+        <w:rPr>
+          <w:rFonts w:ascii="Consolas" w:hAnsi="Consolas"/>
+          <w:color w:val="141A22"/>
+          <w:sz w:val="17"/>
+        </w:rPr>
+        <w:t xml:space="preserve">default is a strong claim and must never be presented as the sponsor's. Some</w:t>
+      </w:r>
+    </w:p>
+    <w:p>
+      <w:pPr>
+        <w:spacing w:after="0" w:line="240" w:lineRule="auto"/>
+      </w:pPr>
+      <w:r>
+        <w:rPr>
+          <w:rFonts w:ascii="Consolas" w:hAnsi="Consolas"/>
+          <w:color w:val="141A22"/>
+          <w:sz w:val="17"/>
+        </w:rPr>
+        <w:t xml:space="preserve">deals</w:t>
+      </w:r>
+    </w:p>
+    <w:p>
+      <w:pPr>
+        <w:spacing w:after="0" w:line="240" w:lineRule="auto"/>
+      </w:pPr>
+      <w:r>
+        <w:rPr>
+          <w:rFonts w:ascii="Consolas" w:hAnsi="Consolas"/>
+          <w:color w:val="141A22"/>
+          <w:sz w:val="17"/>
+        </w:rPr>
+        <w:t xml:space="preserve">are sold on multiple expansion and produce no base case at all.</w:t>
+      </w:r>
+    </w:p>
+    <w:p>
+      <w:pPr>
+        <w:spacing w:after="0" w:line="240" w:lineRule="auto"/>
+      </w:pPr>
+      <w:r>
+        <w:rPr>
+          <w:rFonts w:ascii="Consolas" w:hAnsi="Consolas"/>
+          <w:color w:val="141A22"/>
+          <w:sz w:val="17"/>
+        </w:rPr>
+        <w:t xml:space="preserve">State it outright: "no multiple was supplied for X; I am using Nx, which is my</w:t>
+      </w:r>
+    </w:p>
+    <w:p>
+      <w:pPr>
+        <w:spacing w:after="0" w:line="240" w:lineRule="auto"/>
+      </w:pPr>
+      <w:r>
+        <w:rPr>
+          <w:rFonts w:ascii="Consolas" w:hAnsi="Consolas"/>
+          <w:color w:val="141A22"/>
+          <w:sz w:val="17"/>
+        </w:rPr>
+        <w:t xml:space="preserve">convention and not anybody's projection." Then carry that flag into every</w:t>
+      </w:r>
+    </w:p>
+    <w:p>
+      <w:pPr>
+        <w:spacing w:after="0" w:line="240" w:lineRule="auto"/>
+      </w:pPr>
+      <w:r>
+        <w:rPr>
+          <w:rFonts w:ascii="Consolas" w:hAnsi="Consolas"/>
+          <w:color w:val="141A22"/>
+          <w:sz w:val="17"/>
+        </w:rPr>
+        <w:t xml:space="preserve">table.</w:t>
+      </w:r>
+    </w:p>
+    <w:p>
+      <w:pPr>
+        <w:spacing w:after="0" w:line="240" w:lineRule="auto"/>
+      </w:pPr>
+      <w:r>
+        <w:rPr>
+          <w:rFonts w:ascii="Consolas" w:hAnsi="Consolas"/>
+          <w:color w:val="141A22"/>
+          <w:sz w:val="17"/>
+        </w:rPr>
+        <w:t xml:space="preserve"/>
+      </w:r>
+    </w:p>
+    <w:p>
+      <w:pPr>
+        <w:spacing w:after="0" w:line="240" w:lineRule="auto"/>
+      </w:pPr>
+      <w:r>
+        <w:rPr>
+          <w:rFonts w:ascii="Consolas" w:hAnsi="Consolas"/>
+          <w:color w:val="141A22"/>
+          <w:sz w:val="17"/>
+        </w:rPr>
         <w:t>STEP 4 - SKEW THE TIMING LATE. EXITS SLIP; NOTHING MAKES THEM EARLY.</w:t>
       </w:r>
     </w:p>
@@ -2267,6 +3136,123 @@
           <w:color w:val="141A22"/>
           <w:sz w:val="17"/>
         </w:rPr>
+        <w:t xml:space="preserve">STEP 4c - FUND OR SINGLE DEAL IS AN INPUT. ASK FOR IT IN THOSE WORDS.</w:t>
+      </w:r>
+    </w:p>
+    <w:p>
+      <w:pPr>
+        <w:spacing w:after="0" w:line="240" w:lineRule="auto"/>
+      </w:pPr>
+      <w:r>
+        <w:rPr>
+          <w:rFonts w:ascii="Consolas" w:hAnsi="Consolas"/>
+          <w:color w:val="141A22"/>
+          <w:sz w:val="17"/>
+        </w:rPr>
+        <w:t xml:space="preserve">Do not infer it from a deal count. Ask "is this a fund or a single deal?" -</w:t>
+      </w:r>
+    </w:p>
+    <w:p>
+      <w:pPr>
+        <w:spacing w:after="0" w:line="240" w:lineRule="auto"/>
+      </w:pPr>
+      <w:r>
+        <w:rPr>
+          <w:rFonts w:ascii="Consolas" w:hAnsi="Consolas"/>
+          <w:color w:val="141A22"/>
+          <w:sz w:val="17"/>
+        </w:rPr>
+        <w:t xml:space="preserve">anyone</w:t>
+      </w:r>
+    </w:p>
+    <w:p>
+      <w:pPr>
+        <w:spacing w:after="0" w:line="240" w:lineRule="auto"/>
+      </w:pPr>
+      <w:r>
+        <w:rPr>
+          <w:rFonts w:ascii="Consolas" w:hAnsi="Consolas"/>
+          <w:color w:val="141A22"/>
+          <w:sz w:val="17"/>
+        </w:rPr>
+        <w:t xml:space="preserve">who knows their own position can answer that, and a stated answer beats every</w:t>
+      </w:r>
+    </w:p>
+    <w:p>
+      <w:pPr>
+        <w:spacing w:after="0" w:line="240" w:lineRule="auto"/>
+      </w:pPr>
+      <w:r>
+        <w:rPr>
+          <w:rFonts w:ascii="Consolas" w:hAnsi="Consolas"/>
+          <w:color w:val="141A22"/>
+          <w:sz w:val="17"/>
+        </w:rPr>
+        <w:t xml:space="preserve">inference in STEP 3a and STEP 4a.</w:t>
+      </w:r>
+    </w:p>
+    <w:p>
+      <w:pPr>
+        <w:spacing w:after="0" w:line="240" w:lineRule="auto"/>
+      </w:pPr>
+      <w:r>
+        <w:rPr>
+          <w:rFonts w:ascii="Consolas" w:hAnsi="Consolas"/>
+          <w:color w:val="141A22"/>
+          <w:sz w:val="17"/>
+        </w:rPr>
+        <w:t xml:space="preserve">The deal count still does one job: a venture fund holding 20 or more companies</w:t>
+      </w:r>
+    </w:p>
+    <w:p>
+      <w:pPr>
+        <w:spacing w:after="0" w:line="240" w:lineRule="auto"/>
+      </w:pPr>
+      <w:r>
+        <w:rPr>
+          <w:rFonts w:ascii="Consolas" w:hAnsi="Consolas"/>
+          <w:color w:val="141A22"/>
+          <w:sz w:val="17"/>
+        </w:rPr>
+        <w:t xml:space="preserve">is</w:t>
+      </w:r>
+    </w:p>
+    <w:p>
+      <w:pPr>
+        <w:spacing w:after="0" w:line="240" w:lineRule="auto"/>
+      </w:pPr>
+      <w:r>
+        <w:rPr>
+          <w:rFonts w:ascii="Consolas" w:hAnsi="Consolas"/>
+          <w:color w:val="141A22"/>
+          <w:sz w:val="17"/>
+        </w:rPr>
+        <w:t xml:space="preserve">PRICED differently. It no longer decides whether the payout is staged.</w:t>
+      </w:r>
+    </w:p>
+    <w:p>
+      <w:pPr>
+        <w:spacing w:after="0" w:line="240" w:lineRule="auto"/>
+      </w:pPr>
+      <w:r>
+        <w:rPr>
+          <w:rFonts w:ascii="Consolas" w:hAnsi="Consolas"/>
+          <w:color w:val="141A22"/>
+          <w:sz w:val="17"/>
+        </w:rPr>
+        <w:t xml:space="preserve"/>
+      </w:r>
+    </w:p>
+    <w:p>
+      <w:pPr>
+        <w:spacing w:after="0" w:line="240" w:lineRule="auto"/>
+      </w:pPr>
+      <w:r>
+        <w:rPr>
+          <w:rFonts w:ascii="Consolas" w:hAnsi="Consolas"/>
+          <w:color w:val="141A22"/>
+          <w:sz w:val="17"/>
+        </w:rPr>
         <w:t>STEP 5 - USE THE COMMITMENT AS THE BASIS, AND PUT THE CALLS ON THE SAME GRID.</w:t>
       </w:r>
     </w:p>
@@ -2396,6 +3382,175 @@
           <w:color w:val="141A22"/>
           <w:sz w:val="17"/>
         </w:rPr>
+        <w:t xml:space="preserve">STEP 5a - WHERE TERMS DEPEND ON TICKET SIZE, RESOLVE THE CLASS FROM THE</w:t>
+      </w:r>
+    </w:p>
+    <w:p>
+      <w:pPr>
+        <w:spacing w:after="0" w:line="240" w:lineRule="auto"/>
+      </w:pPr>
+      <w:r>
+        <w:rPr>
+          <w:rFonts w:ascii="Consolas" w:hAnsi="Consolas"/>
+          <w:color w:val="141A22"/>
+          <w:sz w:val="17"/>
+        </w:rPr>
+        <w:t xml:space="preserve">COMMITMENT.</w:t>
+      </w:r>
+    </w:p>
+    <w:p>
+      <w:pPr>
+        <w:spacing w:after="0" w:line="240" w:lineRule="auto"/>
+      </w:pPr>
+      <w:r>
+        <w:rPr>
+          <w:rFonts w:ascii="Consolas" w:hAnsi="Consolas"/>
+          <w:color w:val="141A22"/>
+          <w:sz w:val="17"/>
+        </w:rPr>
+        <w:t xml:space="preserve">Many funds run share classes with different preferred rates by cheque size - a</w:t>
+      </w:r>
+    </w:p>
+    <w:p>
+      <w:pPr>
+        <w:spacing w:after="0" w:line="240" w:lineRule="auto"/>
+      </w:pPr>
+      <w:r>
+        <w:rPr>
+          <w:rFonts w:ascii="Consolas" w:hAnsi="Consolas"/>
+          <w:color w:val="141A22"/>
+          <w:sz w:val="17"/>
+        </w:rPr>
+        <w:t xml:space="preserve">6%</w:t>
+      </w:r>
+    </w:p>
+    <w:p>
+      <w:pPr>
+        <w:spacing w:after="0" w:line="240" w:lineRule="auto"/>
+      </w:pPr>
+      <w:r>
+        <w:rPr>
+          <w:rFonts w:ascii="Consolas" w:hAnsi="Consolas"/>
+          <w:color w:val="141A22"/>
+          <w:sz w:val="17"/>
+        </w:rPr>
+        <w:t xml:space="preserve">class up to $250k and 9% above it, say. Do not ask the user to work out which</w:t>
+      </w:r>
+    </w:p>
+    <w:p>
+      <w:pPr>
+        <w:spacing w:after="0" w:line="240" w:lineRule="auto"/>
+      </w:pPr>
+      <w:r>
+        <w:rPr>
+          <w:rFonts w:ascii="Consolas" w:hAnsi="Consolas"/>
+          <w:color w:val="141A22"/>
+          <w:sz w:val="17"/>
+        </w:rPr>
+        <w:t xml:space="preserve">band</w:t>
+      </w:r>
+    </w:p>
+    <w:p>
+      <w:pPr>
+        <w:spacing w:after="0" w:line="240" w:lineRule="auto"/>
+      </w:pPr>
+      <w:r>
+        <w:rPr>
+          <w:rFonts w:ascii="Consolas" w:hAnsi="Consolas"/>
+          <w:color w:val="141A22"/>
+          <w:sz w:val="17"/>
+        </w:rPr>
+        <w:t xml:space="preserve">they are in and do not average the classes.</w:t>
+      </w:r>
+    </w:p>
+    <w:p>
+      <w:pPr>
+        <w:spacing w:after="0" w:line="240" w:lineRule="auto"/>
+      </w:pPr>
+      <w:r>
+        <w:rPr>
+          <w:rFonts w:ascii="Consolas" w:hAnsi="Consolas"/>
+          <w:color w:val="141A22"/>
+          <w:sz w:val="17"/>
+        </w:rPr>
+        <w:t xml:space="preserve">Take the commitment, pick the band it falls in, and SAY WHICH ONE you used. If</w:t>
+      </w:r>
+    </w:p>
+    <w:p>
+      <w:pPr>
+        <w:spacing w:after="0" w:line="240" w:lineRule="auto"/>
+      </w:pPr>
+      <w:r>
+        <w:rPr>
+          <w:rFonts w:ascii="Consolas" w:hAnsi="Consolas"/>
+          <w:color w:val="141A22"/>
+          <w:sz w:val="17"/>
+        </w:rPr>
+        <w:t xml:space="preserve">the</w:t>
+      </w:r>
+    </w:p>
+    <w:p>
+      <w:pPr>
+        <w:spacing w:after="0" w:line="240" w:lineRule="auto"/>
+      </w:pPr>
+      <w:r>
+        <w:rPr>
+          <w:rFonts w:ascii="Consolas" w:hAnsi="Consolas"/>
+          <w:color w:val="141A22"/>
+          <w:sz w:val="17"/>
+        </w:rPr>
+        <w:t xml:space="preserve">bands are stated but the commitment does not resolve one, say that too rather</w:t>
+      </w:r>
+    </w:p>
+    <w:p>
+      <w:pPr>
+        <w:spacing w:after="0" w:line="240" w:lineRule="auto"/>
+      </w:pPr>
+      <w:r>
+        <w:rPr>
+          <w:rFonts w:ascii="Consolas" w:hAnsi="Consolas"/>
+          <w:color w:val="141A22"/>
+          <w:sz w:val="17"/>
+        </w:rPr>
+        <w:t xml:space="preserve">than</w:t>
+      </w:r>
+    </w:p>
+    <w:p>
+      <w:pPr>
+        <w:spacing w:after="0" w:line="240" w:lineRule="auto"/>
+      </w:pPr>
+      <w:r>
+        <w:rPr>
+          <w:rFonts w:ascii="Consolas" w:hAnsi="Consolas"/>
+          <w:color w:val="141A22"/>
+          <w:sz w:val="17"/>
+        </w:rPr>
+        <w:t xml:space="preserve">choosing the flattering end.</w:t>
+      </w:r>
+    </w:p>
+    <w:p>
+      <w:pPr>
+        <w:spacing w:after="0" w:line="240" w:lineRule="auto"/>
+      </w:pPr>
+      <w:r>
+        <w:rPr>
+          <w:rFonts w:ascii="Consolas" w:hAnsi="Consolas"/>
+          <w:color w:val="141A22"/>
+          <w:sz w:val="17"/>
+        </w:rPr>
+        <w:t xml:space="preserve"/>
+      </w:r>
+    </w:p>
+    <w:p>
+      <w:pPr>
+        <w:spacing w:after="0" w:line="240" w:lineRule="auto"/>
+      </w:pPr>
+      <w:r>
+        <w:rPr>
+          <w:rFonts w:ascii="Consolas" w:hAnsi="Consolas"/>
+          <w:color w:val="141A22"/>
+          <w:sz w:val="17"/>
+        </w:rPr>
         <w:t>STEP 6 - COMPUTE. CHOOSE THE RIGHT MODE AND SAY WHICH ONE YOU USED.</w:t>
       </w:r>
     </w:p>
@@ -2976,6 +4131,565 @@
           <w:color w:val="141A22"/>
           <w:sz w:val="17"/>
         </w:rPr>
+        <w:t xml:space="preserve">STEP 10 - IRR, IF THE USER ASKS FOR ONE. THE AGGREGATION RULE IS NOT OPTIONAL.</w:t>
+      </w:r>
+    </w:p>
+    <w:p>
+      <w:pPr>
+        <w:spacing w:after="0" w:line="240" w:lineRule="auto"/>
+      </w:pPr>
+      <w:r>
+        <w:rPr>
+          <w:rFonts w:ascii="Consolas" w:hAnsi="Consolas"/>
+          <w:color w:val="141A22"/>
+          <w:sz w:val="17"/>
+        </w:rPr>
+        <w:t xml:space="preserve">A PORTFOLIO IRR IS NOT THE AVERAGE OF ITS DEALS' IRRs. IRR is not additive and</w:t>
+      </w:r>
+    </w:p>
+    <w:p>
+      <w:pPr>
+        <w:spacing w:after="0" w:line="240" w:lineRule="auto"/>
+      </w:pPr>
+      <w:r>
+        <w:rPr>
+          <w:rFonts w:ascii="Consolas" w:hAnsi="Consolas"/>
+          <w:color w:val="141A22"/>
+          <w:sz w:val="17"/>
+        </w:rPr>
+        <w:t xml:space="preserve">it</w:t>
+      </w:r>
+    </w:p>
+    <w:p>
+      <w:pPr>
+        <w:spacing w:after="0" w:line="240" w:lineRule="auto"/>
+      </w:pPr>
+      <w:r>
+        <w:rPr>
+          <w:rFonts w:ascii="Consolas" w:hAnsi="Consolas"/>
+          <w:color w:val="141A22"/>
+          <w:sz w:val="17"/>
+        </w:rPr>
+        <w:t xml:space="preserve">cannot be averaged, commitment-weighted or otherwise combined. Pool every</w:t>
+      </w:r>
+    </w:p>
+    <w:p>
+      <w:pPr>
+        <w:spacing w:after="0" w:line="240" w:lineRule="auto"/>
+      </w:pPr>
+      <w:r>
+        <w:rPr>
+          <w:rFonts w:ascii="Consolas" w:hAnsi="Consolas"/>
+          <w:color w:val="141A22"/>
+          <w:sz w:val="17"/>
+        </w:rPr>
+        <w:t xml:space="preserve">position's</w:t>
+      </w:r>
+    </w:p>
+    <w:p>
+      <w:pPr>
+        <w:spacing w:after="0" w:line="240" w:lineRule="auto"/>
+      </w:pPr>
+      <w:r>
+        <w:rPr>
+          <w:rFonts w:ascii="Consolas" w:hAnsi="Consolas"/>
+          <w:color w:val="141A22"/>
+          <w:sz w:val="17"/>
+        </w:rPr>
+        <w:t xml:space="preserve">signed cash flow into ONE stream, solve once, and only then rank across runs.</w:t>
+      </w:r>
+    </w:p>
+    <w:p>
+      <w:pPr>
+        <w:spacing w:after="0" w:line="240" w:lineRule="auto"/>
+      </w:pPr>
+      <w:r>
+        <w:rPr>
+          <w:rFonts w:ascii="Consolas" w:hAnsi="Consolas"/>
+          <w:color w:val="141A22"/>
+          <w:sz w:val="17"/>
+        </w:rPr>
+        <w:t xml:space="preserve">On a real thirteen-position book, averaging the deals gave a median of MINUS</w:t>
+      </w:r>
+    </w:p>
+    <w:p>
+      <w:pPr>
+        <w:spacing w:after="0" w:line="240" w:lineRule="auto"/>
+      </w:pPr>
+      <w:r>
+        <w:rPr>
+          <w:rFonts w:ascii="Consolas" w:hAnsi="Consolas"/>
+          <w:color w:val="141A22"/>
+          <w:sz w:val="17"/>
+        </w:rPr>
+        <w:t xml:space="preserve">5.4%</w:t>
+      </w:r>
+    </w:p>
+    <w:p>
+      <w:pPr>
+        <w:spacing w:after="0" w:line="240" w:lineRule="auto"/>
+      </w:pPr>
+      <w:r>
+        <w:rPr>
+          <w:rFonts w:ascii="Consolas" w:hAnsi="Consolas"/>
+          <w:color w:val="141A22"/>
+          <w:sz w:val="17"/>
+        </w:rPr>
+        <w:t xml:space="preserve">against a correct 12.4%. That is not a rounding artefact, it inverts the</w:t>
+      </w:r>
+    </w:p>
+    <w:p>
+      <w:pPr>
+        <w:spacing w:after="0" w:line="240" w:lineRule="auto"/>
+      </w:pPr>
+      <w:r>
+        <w:rPr>
+          <w:rFonts w:ascii="Consolas" w:hAnsi="Consolas"/>
+          <w:color w:val="141A22"/>
+          <w:sz w:val="17"/>
+        </w:rPr>
+        <w:t xml:space="preserve">answer.</w:t>
+      </w:r>
+    </w:p>
+    <w:p>
+      <w:pPr>
+        <w:spacing w:after="0" w:line="240" w:lineRule="auto"/>
+      </w:pPr>
+      <w:r>
+        <w:rPr>
+          <w:rFonts w:ascii="Consolas" w:hAnsi="Consolas"/>
+          <w:color w:val="141A22"/>
+          <w:sz w:val="17"/>
+        </w:rPr>
+        <w:t xml:space="preserve">The reason is scale: a total loss on a $5,000 ticket weighs the same as one on</w:t>
+      </w:r>
+    </w:p>
+    <w:p>
+      <w:pPr>
+        <w:spacing w:after="0" w:line="240" w:lineRule="auto"/>
+      </w:pPr>
+      <w:r>
+        <w:rPr>
+          <w:rFonts w:ascii="Consolas" w:hAnsi="Consolas"/>
+          <w:color w:val="141A22"/>
+          <w:sz w:val="17"/>
+        </w:rPr>
+        <w:t xml:space="preserve">a</w:t>
+      </w:r>
+    </w:p>
+    <w:p>
+      <w:pPr>
+        <w:spacing w:after="0" w:line="240" w:lineRule="auto"/>
+      </w:pPr>
+      <w:r>
+        <w:rPr>
+          <w:rFonts w:ascii="Consolas" w:hAnsi="Consolas"/>
+          <w:color w:val="141A22"/>
+          <w:sz w:val="17"/>
+        </w:rPr>
+        <w:t xml:space="preserve">$250,000 ticket in an average, and pooling is the only operation that knows</w:t>
+      </w:r>
+    </w:p>
+    <w:p>
+      <w:pPr>
+        <w:spacing w:after="0" w:line="240" w:lineRule="auto"/>
+      </w:pPr>
+      <w:r>
+        <w:rPr>
+          <w:rFonts w:ascii="Consolas" w:hAnsi="Consolas"/>
+          <w:color w:val="141A22"/>
+          <w:sz w:val="17"/>
+        </w:rPr>
+        <w:t xml:space="preserve">better.</w:t>
+      </w:r>
+    </w:p>
+    <w:p>
+      <w:pPr>
+        <w:spacing w:after="0" w:line="240" w:lineRule="auto"/>
+      </w:pPr>
+      <w:r>
+        <w:rPr>
+          <w:rFonts w:ascii="Consolas" w:hAnsi="Consolas"/>
+          <w:color w:val="141A22"/>
+          <w:sz w:val="17"/>
+        </w:rPr>
+        <w:t xml:space="preserve">BUILD THE STREAM FROM THE TERMS, not from the calendar you are reporting on.</w:t>
+      </w:r>
+    </w:p>
+    <w:p>
+      <w:pPr>
+        <w:spacing w:after="0" w:line="240" w:lineRule="auto"/>
+      </w:pPr>
+      <w:r>
+        <w:rPr>
+          <w:rFonts w:ascii="Consolas" w:hAnsi="Consolas"/>
+          <w:color w:val="141A22"/>
+          <w:sz w:val="17"/>
+        </w:rPr>
+        <w:t xml:space="preserve">Funded</w:t>
+      </w:r>
+    </w:p>
+    <w:p>
+      <w:pPr>
+        <w:spacing w:after="0" w:line="240" w:lineRule="auto"/>
+      </w:pPr>
+      <w:r>
+        <w:rPr>
+          <w:rFonts w:ascii="Consolas" w:hAnsi="Consolas"/>
+          <w:color w:val="141A22"/>
+          <w:sz w:val="17"/>
+        </w:rPr>
+        <w:t xml:space="preserve">capital at the vintage year as a negative, remaining calls as negatives over</w:t>
+      </w:r>
+    </w:p>
+    <w:p>
+      <w:pPr>
+        <w:spacing w:after="0" w:line="240" w:lineRule="auto"/>
+      </w:pPr>
+      <w:r>
+        <w:rPr>
+          <w:rFonts w:ascii="Consolas" w:hAnsi="Consolas"/>
+          <w:color w:val="141A22"/>
+          <w:sz w:val="17"/>
+        </w:rPr>
+        <w:t xml:space="preserve">the</w:t>
+      </w:r>
+    </w:p>
+    <w:p>
+      <w:pPr>
+        <w:spacing w:after="0" w:line="240" w:lineRule="auto"/>
+      </w:pPr>
+      <w:r>
+        <w:rPr>
+          <w:rFonts w:ascii="Consolas" w:hAnsi="Consolas"/>
+          <w:color w:val="141A22"/>
+          <w:sz w:val="17"/>
+        </w:rPr>
+        <w:t xml:space="preserve">call period, preferred returns as positives over the hold, exit proceeds</w:t>
+      </w:r>
+    </w:p>
+    <w:p>
+      <w:pPr>
+        <w:spacing w:after="0" w:line="240" w:lineRule="auto"/>
+      </w:pPr>
+      <w:r>
+        <w:rPr>
+          <w:rFonts w:ascii="Consolas" w:hAnsi="Consolas"/>
+          <w:color w:val="141A22"/>
+          <w:sz w:val="17"/>
+        </w:rPr>
+        <w:t xml:space="preserve">positive</w:t>
+      </w:r>
+    </w:p>
+    <w:p>
+      <w:pPr>
+        <w:spacing w:after="0" w:line="240" w:lineRule="auto"/>
+      </w:pPr>
+      <w:r>
+        <w:rPr>
+          <w:rFonts w:ascii="Consolas" w:hAnsi="Consolas"/>
+          <w:color w:val="141A22"/>
+          <w:sz w:val="17"/>
+        </w:rPr>
+        <w:t xml:space="preserve">across the payout window. A position funded before your first reported year</w:t>
+      </w:r>
+    </w:p>
+    <w:p>
+      <w:pPr>
+        <w:spacing w:after="0" w:line="240" w:lineRule="auto"/>
+      </w:pPr>
+      <w:r>
+        <w:rPr>
+          <w:rFonts w:ascii="Consolas" w:hAnsi="Consolas"/>
+          <w:color w:val="141A22"/>
+          <w:sz w:val="17"/>
+        </w:rPr>
+        <w:t xml:space="preserve">still</w:t>
+      </w:r>
+    </w:p>
+    <w:p>
+      <w:pPr>
+        <w:spacing w:after="0" w:line="240" w:lineRule="auto"/>
+      </w:pPr>
+      <w:r>
+        <w:rPr>
+          <w:rFonts w:ascii="Consolas" w:hAnsi="Consolas"/>
+          <w:color w:val="141A22"/>
+          <w:sz w:val="17"/>
+        </w:rPr>
+        <w:t xml:space="preserve">had those contributions, and an IRR missing its early outflows is flattering.</w:t>
+      </w:r>
+    </w:p>
+    <w:p>
+      <w:pPr>
+        <w:spacing w:after="0" w:line="240" w:lineRule="auto"/>
+      </w:pPr>
+      <w:r>
+        <w:rPr>
+          <w:rFonts w:ascii="Consolas" w:hAnsi="Consolas"/>
+          <w:color w:val="141A22"/>
+          <w:sz w:val="17"/>
+        </w:rPr>
+        <w:t xml:space="preserve">THREE ANSWERS THAT ARE NOT NUMBERS, and none of them is 0%:</w:t>
+      </w:r>
+    </w:p>
+    <w:p>
+      <w:pPr>
+        <w:spacing w:after="0" w:line="240" w:lineRule="auto"/>
+      </w:pPr>
+      <w:r>
+        <w:rPr>
+          <w:rFonts w:ascii="Consolas" w:hAnsi="Consolas"/>
+          <w:color w:val="141A22"/>
+          <w:sz w:val="17"/>
+        </w:rPr>
+        <w:t xml:space="preserve">  nothing invested         undefined. Say n/a.</w:t>
+      </w:r>
+    </w:p>
+    <w:p>
+      <w:pPr>
+        <w:spacing w:after="0" w:line="240" w:lineRule="auto"/>
+      </w:pPr>
+      <w:r>
+        <w:rPr>
+          <w:rFonts w:ascii="Consolas" w:hAnsi="Consolas"/>
+          <w:color w:val="141A22"/>
+          <w:sz w:val="17"/>
+        </w:rPr>
+        <w:t xml:space="preserve">  invested, nothing back   exactly MINUS 100%. Not 0%.</w:t>
+      </w:r>
+    </w:p>
+    <w:p>
+      <w:pPr>
+        <w:spacing w:after="0" w:line="240" w:lineRule="auto"/>
+      </w:pPr>
+      <w:r>
+        <w:rPr>
+          <w:rFonts w:ascii="Consolas" w:hAnsi="Consolas"/>
+          <w:color w:val="141A22"/>
+          <w:sz w:val="17"/>
+        </w:rPr>
+        <w:t xml:space="preserve">  faster than you bracket  a bound, e.g. "&gt;1000%". Not a figure.</w:t>
+      </w:r>
+    </w:p>
+    <w:p>
+      <w:pPr>
+        <w:spacing w:after="0" w:line="240" w:lineRule="auto"/>
+      </w:pPr>
+      <w:r>
+        <w:rPr>
+          <w:rFonts w:ascii="Consolas" w:hAnsi="Consolas"/>
+          <w:color w:val="141A22"/>
+          <w:sz w:val="17"/>
+        </w:rPr>
+        <w:t xml:space="preserve">0% means the money came back and nothing more. Printing it for a total loss is</w:t>
+      </w:r>
+    </w:p>
+    <w:p>
+      <w:pPr>
+        <w:spacing w:after="0" w:line="240" w:lineRule="auto"/>
+      </w:pPr>
+      <w:r>
+        <w:rPr>
+          <w:rFonts w:ascii="Consolas" w:hAnsi="Consolas"/>
+          <w:color w:val="141A22"/>
+          <w:sz w:val="17"/>
+        </w:rPr>
+        <w:t xml:space="preserve">the</w:t>
+      </w:r>
+    </w:p>
+    <w:p>
+      <w:pPr>
+        <w:spacing w:after="0" w:line="240" w:lineRule="auto"/>
+      </w:pPr>
+      <w:r>
+        <w:rPr>
+          <w:rFonts w:ascii="Consolas" w:hAnsi="Consolas"/>
+          <w:color w:val="141A22"/>
+          <w:sz w:val="17"/>
+        </w:rPr>
+        <w:t xml:space="preserve">worst single error available here.</w:t>
+      </w:r>
+    </w:p>
+    <w:p>
+      <w:pPr>
+        <w:spacing w:after="0" w:line="240" w:lineRule="auto"/>
+      </w:pPr>
+      <w:r>
+        <w:rPr>
+          <w:rFonts w:ascii="Consolas" w:hAnsi="Consolas"/>
+          <w:color w:val="141A22"/>
+          <w:sz w:val="17"/>
+        </w:rPr>
+        <w:t xml:space="preserve">IT IS A CASH IRR AND IT WILL LOOK LOW. It counts distributions received and no</w:t>
+      </w:r>
+    </w:p>
+    <w:p>
+      <w:pPr>
+        <w:spacing w:after="0" w:line="240" w:lineRule="auto"/>
+      </w:pPr>
+      <w:r>
+        <w:rPr>
+          <w:rFonts w:ascii="Consolas" w:hAnsi="Consolas"/>
+          <w:color w:val="141A22"/>
+          <w:sz w:val="17"/>
+        </w:rPr>
+        <w:t xml:space="preserve">paper</w:t>
+      </w:r>
+    </w:p>
+    <w:p>
+      <w:pPr>
+        <w:spacing w:after="0" w:line="240" w:lineRule="auto"/>
+      </w:pPr>
+      <w:r>
+        <w:rPr>
+          <w:rFonts w:ascii="Consolas" w:hAnsi="Consolas"/>
+          <w:color w:val="141A22"/>
+          <w:sz w:val="17"/>
+        </w:rPr>
+        <w:t xml:space="preserve">marks, so it sits below any IRR a sponsor reports, because theirs includes</w:t>
+      </w:r>
+    </w:p>
+    <w:p>
+      <w:pPr>
+        <w:spacing w:after="0" w:line="240" w:lineRule="auto"/>
+      </w:pPr>
+      <w:r>
+        <w:rPr>
+          <w:rFonts w:ascii="Consolas" w:hAnsi="Consolas"/>
+          <w:color w:val="141A22"/>
+          <w:sz w:val="17"/>
+        </w:rPr>
+        <w:t xml:space="preserve">unrealised carrying value. Say this beside the number, every time.</w:t>
+      </w:r>
+    </w:p>
+    <w:p>
+      <w:pPr>
+        <w:spacing w:after="0" w:line="240" w:lineRule="auto"/>
+      </w:pPr>
+      <w:r>
+        <w:rPr>
+          <w:rFonts w:ascii="Consolas" w:hAnsi="Consolas"/>
+          <w:color w:val="141A22"/>
+          <w:sz w:val="17"/>
+        </w:rPr>
+        <w:t xml:space="preserve">ALSO GIVE THE SPONSOR CASE, which is the sponsor's own multiple reached at the</w:t>
+      </w:r>
+    </w:p>
+    <w:p>
+      <w:pPr>
+        <w:spacing w:after="0" w:line="240" w:lineRule="auto"/>
+      </w:pPr>
+      <w:r>
+        <w:rPr>
+          <w:rFonts w:ascii="Consolas" w:hAnsi="Consolas"/>
+          <w:color w:val="141A22"/>
+          <w:sz w:val="17"/>
+        </w:rPr>
+        <w:t xml:space="preserve">expected exit. Their figure lives in the top tenth of outcomes, so it is</w:t>
+      </w:r>
+    </w:p>
+    <w:p>
+      <w:pPr>
+        <w:spacing w:after="0" w:line="240" w:lineRule="auto"/>
+      </w:pPr>
+      <w:r>
+        <w:rPr>
+          <w:rFonts w:ascii="Consolas" w:hAnsi="Consolas"/>
+          <w:color w:val="141A22"/>
+          <w:sz w:val="17"/>
+        </w:rPr>
+        <w:t xml:space="preserve">invisible</w:t>
+      </w:r>
+    </w:p>
+    <w:p>
+      <w:pPr>
+        <w:spacing w:after="0" w:line="240" w:lineRule="auto"/>
+      </w:pPr>
+      <w:r>
+        <w:rPr>
+          <w:rFonts w:ascii="Consolas" w:hAnsi="Consolas"/>
+          <w:color w:val="141A22"/>
+          <w:sz w:val="17"/>
+        </w:rPr>
+        <w:t xml:space="preserve">at the median - deals with wildly different sponsor multiples otherwise print</w:t>
+      </w:r>
+    </w:p>
+    <w:p>
+      <w:pPr>
+        <w:spacing w:after="0" w:line="240" w:lineRule="auto"/>
+      </w:pPr>
+      <w:r>
+        <w:rPr>
+          <w:rFonts w:ascii="Consolas" w:hAnsi="Consolas"/>
+          <w:color w:val="141A22"/>
+          <w:sz w:val="17"/>
+        </w:rPr>
+        <w:t xml:space="preserve">identical percentiles. Showing both is the only way the gap can be argued</w:t>
+      </w:r>
+    </w:p>
+    <w:p>
+      <w:pPr>
+        <w:spacing w:after="0" w:line="240" w:lineRule="auto"/>
+      </w:pPr>
+      <w:r>
+        <w:rPr>
+          <w:rFonts w:ascii="Consolas" w:hAnsi="Consolas"/>
+          <w:color w:val="141A22"/>
+          <w:sz w:val="17"/>
+        </w:rPr>
+        <w:t xml:space="preserve">with.</w:t>
+      </w:r>
+    </w:p>
+    <w:p>
+      <w:pPr>
+        <w:spacing w:after="0" w:line="240" w:lineRule="auto"/>
+      </w:pPr>
+      <w:r>
+        <w:rPr>
+          <w:rFonts w:ascii="Consolas" w:hAnsi="Consolas"/>
+          <w:color w:val="141A22"/>
+          <w:sz w:val="17"/>
+        </w:rPr>
+        <w:t xml:space="preserve">IF YOU CANNOT EXECUTE CODE you can still compute the sponsor case and a Mode A</w:t>
+      </w:r>
+    </w:p>
+    <w:p>
+      <w:pPr>
+        <w:spacing w:after="0" w:line="240" w:lineRule="auto"/>
+      </w:pPr>
+      <w:r>
+        <w:rPr>
+          <w:rFonts w:ascii="Consolas" w:hAnsi="Consolas"/>
+          <w:color w:val="141A22"/>
+          <w:sz w:val="17"/>
+        </w:rPr>
+        <w:t xml:space="preserve">expected-case IRR exactly. You MUST NOT report an IRR median or percentile.</w:t>
+      </w:r>
+    </w:p>
+    <w:p>
+      <w:pPr>
+        <w:spacing w:after="0" w:line="240" w:lineRule="auto"/>
+      </w:pPr>
+      <w:r>
+        <w:rPr>
+          <w:rFonts w:ascii="Consolas" w:hAnsi="Consolas"/>
+          <w:color w:val="141A22"/>
+          <w:sz w:val="17"/>
+        </w:rPr>
+        <w:t xml:space="preserve"/>
+      </w:r>
+    </w:p>
+    <w:p>
+      <w:pPr>
+        <w:spacing w:after="0" w:line="240" w:lineRule="auto"/>
+      </w:pPr>
+      <w:r>
+        <w:rPr>
+          <w:rFonts w:ascii="Consolas" w:hAnsi="Consolas"/>
+          <w:color w:val="141A22"/>
+          <w:sz w:val="17"/>
+        </w:rPr>
         <w:t>OUTPUT, IN THIS ORDER</w:t>
       </w:r>
     </w:p>
@@ -3197,6 +4911,162 @@
           <w:color w:val="141A22"/>
           <w:sz w:val="17"/>
         </w:rPr>
+        <w:t xml:space="preserve">  4b. THE CONE. The cumulative band drawn year by year - bad run, typical,</w:t>
+      </w:r>
+    </w:p>
+    <w:p>
+      <w:pPr>
+        <w:spacing w:after="0" w:line="240" w:lineRule="auto"/>
+      </w:pPr>
+      <w:r>
+        <w:rPr>
+          <w:rFonts w:ascii="Consolas" w:hAnsi="Consolas"/>
+          <w:color w:val="141A22"/>
+          <w:sz w:val="17"/>
+        </w:rPr>
+        <w:t xml:space="preserve">  good run</w:t>
+      </w:r>
+    </w:p>
+    <w:p>
+      <w:pPr>
+        <w:spacing w:after="0" w:line="240" w:lineRule="auto"/>
+      </w:pPr>
+      <w:r>
+        <w:rPr>
+          <w:rFonts w:ascii="Consolas" w:hAnsi="Consolas"/>
+          <w:color w:val="141A22"/>
+          <w:sz w:val="17"/>
+        </w:rPr>
+        <w:t xml:space="preserve">     - with a line at the full commitment so the reader can see how many years</w:t>
+      </w:r>
+    </w:p>
+    <w:p>
+      <w:pPr>
+        <w:spacing w:after="0" w:line="240" w:lineRule="auto"/>
+      </w:pPr>
+      <w:r>
+        <w:rPr>
+          <w:rFonts w:ascii="Consolas" w:hAnsi="Consolas"/>
+          <w:color w:val="141A22"/>
+          <w:sz w:val="17"/>
+        </w:rPr>
+        <w:t xml:space="preserve">     the</w:t>
+      </w:r>
+    </w:p>
+    <w:p>
+      <w:pPr>
+        <w:spacing w:after="0" w:line="240" w:lineRule="auto"/>
+      </w:pPr>
+      <w:r>
+        <w:rPr>
+          <w:rFonts w:ascii="Consolas" w:hAnsi="Consolas"/>
+          <w:color w:val="141A22"/>
+          <w:sz w:val="17"/>
+        </w:rPr>
+        <w:t xml:space="preserve">     whole band sits below getting their money back.</w:t>
+      </w:r>
+    </w:p>
+    <w:p>
+      <w:pPr>
+        <w:spacing w:after="0" w:line="240" w:lineRule="auto"/>
+      </w:pPr>
+      <w:r>
+        <w:rPr>
+          <w:rFonts w:ascii="Consolas" w:hAnsi="Consolas"/>
+          <w:color w:val="141A22"/>
+          <w:sz w:val="17"/>
+        </w:rPr>
+        <w:t xml:space="preserve">  4c. IRR, if asked for. By deal, by asset class and for the whole book,</w:t>
+      </w:r>
+    </w:p>
+    <w:p>
+      <w:pPr>
+        <w:spacing w:after="0" w:line="240" w:lineRule="auto"/>
+      </w:pPr>
+      <w:r>
+        <w:rPr>
+          <w:rFonts w:ascii="Consolas" w:hAnsi="Consolas"/>
+          <w:color w:val="141A22"/>
+          <w:sz w:val="17"/>
+        </w:rPr>
+        <w:t xml:space="preserve">  pooled per</w:t>
+      </w:r>
+    </w:p>
+    <w:p>
+      <w:pPr>
+        <w:spacing w:after="0" w:line="240" w:lineRule="auto"/>
+      </w:pPr>
+      <w:r>
+        <w:rPr>
+          <w:rFonts w:ascii="Consolas" w:hAnsi="Consolas"/>
+          <w:color w:val="141A22"/>
+          <w:sz w:val="17"/>
+        </w:rPr>
+        <w:t xml:space="preserve">     STEP 10, with the sponsor case beside the model's own figure and a note</w:t>
+      </w:r>
+    </w:p>
+    <w:p>
+      <w:pPr>
+        <w:spacing w:after="0" w:line="240" w:lineRule="auto"/>
+      </w:pPr>
+      <w:r>
+        <w:rPr>
+          <w:rFonts w:ascii="Consolas" w:hAnsi="Consolas"/>
+          <w:color w:val="141A22"/>
+          <w:sz w:val="17"/>
+        </w:rPr>
+        <w:t xml:space="preserve">     that</w:t>
+      </w:r>
+    </w:p>
+    <w:p>
+      <w:pPr>
+        <w:spacing w:after="0" w:line="240" w:lineRule="auto"/>
+      </w:pPr>
+      <w:r>
+        <w:rPr>
+          <w:rFonts w:ascii="Consolas" w:hAnsi="Consolas"/>
+          <w:color w:val="141A22"/>
+          <w:sz w:val="17"/>
+        </w:rPr>
+        <w:t xml:space="preserve">     these count cash and not marks. Separately, any marked-up paper value, in</w:t>
+      </w:r>
+    </w:p>
+    <w:p>
+      <w:pPr>
+        <w:spacing w:after="0" w:line="240" w:lineRule="auto"/>
+      </w:pPr>
+      <w:r>
+        <w:rPr>
+          <w:rFonts w:ascii="Consolas" w:hAnsi="Consolas"/>
+          <w:color w:val="141A22"/>
+          <w:sz w:val="17"/>
+        </w:rPr>
+        <w:t xml:space="preserve">     its</w:t>
+      </w:r>
+    </w:p>
+    <w:p>
+      <w:pPr>
+        <w:spacing w:after="0" w:line="240" w:lineRule="auto"/>
+      </w:pPr>
+      <w:r>
+        <w:rPr>
+          <w:rFonts w:ascii="Consolas" w:hAnsi="Consolas"/>
+          <w:color w:val="141A22"/>
+          <w:sz w:val="17"/>
+        </w:rPr>
+        <w:t xml:space="preserve">     own block, outside every cash table.</w:t>
+      </w:r>
+    </w:p>
+    <w:p>
+      <w:pPr>
+        <w:spacing w:after="0" w:line="240" w:lineRule="auto"/>
+      </w:pPr>
+      <w:r>
+        <w:rPr>
+          <w:rFonts w:ascii="Consolas" w:hAnsi="Consolas"/>
+          <w:color w:val="141A22"/>
+          <w:sz w:val="17"/>
+        </w:rPr>
         <w:t xml:space="preserve">  5. GLOSSARY. Define every column in plain language, including why the median rather</w:t>
       </w:r>
     </w:p>
@@ -3483,6 +5353,201 @@
           <w:sz w:val="17"/>
         </w:rPr>
         <w:t xml:space="preserve">  - State your mode (A or B) at the top of every answer.</w:t>
+      </w:r>
+    </w:p>
+    <w:p>
+      <w:pPr>
+        <w:spacing w:after="0" w:line="240" w:lineRule="auto"/>
+      </w:pPr>
+      <w:r>
+        <w:rPr>
+          <w:rFonts w:ascii="Consolas" w:hAnsi="Consolas"/>
+          <w:color w:val="141A22"/>
+          <w:sz w:val="17"/>
+        </w:rPr>
+        <w:t xml:space="preserve">  - Never average or weight per-deal IRRs into a portfolio IRR. Pool the cash</w:t>
+      </w:r>
+    </w:p>
+    <w:p>
+      <w:pPr>
+        <w:spacing w:after="0" w:line="240" w:lineRule="auto"/>
+      </w:pPr>
+      <w:r>
+        <w:rPr>
+          <w:rFonts w:ascii="Consolas" w:hAnsi="Consolas"/>
+          <w:color w:val="141A22"/>
+          <w:sz w:val="17"/>
+        </w:rPr>
+        <w:t xml:space="preserve">  flows</w:t>
+      </w:r>
+    </w:p>
+    <w:p>
+      <w:pPr>
+        <w:spacing w:after="0" w:line="240" w:lineRule="auto"/>
+      </w:pPr>
+      <w:r>
+        <w:rPr>
+          <w:rFonts w:ascii="Consolas" w:hAnsi="Consolas"/>
+          <w:color w:val="141A22"/>
+          <w:sz w:val="17"/>
+        </w:rPr>
+        <w:t xml:space="preserve">    and solve once.</w:t>
+      </w:r>
+    </w:p>
+    <w:p>
+      <w:pPr>
+        <w:spacing w:after="0" w:line="240" w:lineRule="auto"/>
+      </w:pPr>
+      <w:r>
+        <w:rPr>
+          <w:rFonts w:ascii="Consolas" w:hAnsi="Consolas"/>
+          <w:color w:val="141A22"/>
+          <w:sz w:val="17"/>
+        </w:rPr>
+        <w:t xml:space="preserve">  - Never report 0% for a total loss or for an undefined IRR. Minus 100% and</w:t>
+      </w:r>
+    </w:p>
+    <w:p>
+      <w:pPr>
+        <w:spacing w:after="0" w:line="240" w:lineRule="auto"/>
+      </w:pPr>
+      <w:r>
+        <w:rPr>
+          <w:rFonts w:ascii="Consolas" w:hAnsi="Consolas"/>
+          <w:color w:val="141A22"/>
+          <w:sz w:val="17"/>
+        </w:rPr>
+        <w:t xml:space="preserve">  n/a</w:t>
+      </w:r>
+    </w:p>
+    <w:p>
+      <w:pPr>
+        <w:spacing w:after="0" w:line="240" w:lineRule="auto"/>
+      </w:pPr>
+      <w:r>
+        <w:rPr>
+          <w:rFonts w:ascii="Consolas" w:hAnsi="Consolas"/>
+          <w:color w:val="141A22"/>
+          <w:sz w:val="17"/>
+        </w:rPr>
+        <w:t xml:space="preserve">    mean different things and neither is zero.</w:t>
+      </w:r>
+    </w:p>
+    <w:p>
+      <w:pPr>
+        <w:spacing w:after="0" w:line="240" w:lineRule="auto"/>
+      </w:pPr>
+      <w:r>
+        <w:rPr>
+          <w:rFonts w:ascii="Consolas" w:hAnsi="Consolas"/>
+          <w:color w:val="141A22"/>
+          <w:sz w:val="17"/>
+        </w:rPr>
+        <w:t xml:space="preserve">  - Never present a default multiple as the sponsor's. If nobody supplied one,</w:t>
+      </w:r>
+    </w:p>
+    <w:p>
+      <w:pPr>
+        <w:spacing w:after="0" w:line="240" w:lineRule="auto"/>
+      </w:pPr>
+      <w:r>
+        <w:rPr>
+          <w:rFonts w:ascii="Consolas" w:hAnsi="Consolas"/>
+          <w:color w:val="141A22"/>
+          <w:sz w:val="17"/>
+        </w:rPr>
+        <w:t xml:space="preserve">  say</w:t>
+      </w:r>
+    </w:p>
+    <w:p>
+      <w:pPr>
+        <w:spacing w:after="0" w:line="240" w:lineRule="auto"/>
+      </w:pPr>
+      <w:r>
+        <w:rPr>
+          <w:rFonts w:ascii="Consolas" w:hAnsi="Consolas"/>
+          <w:color w:val="141A22"/>
+          <w:sz w:val="17"/>
+        </w:rPr>
+        <w:t xml:space="preserve">    the number is your convention.</w:t>
+      </w:r>
+    </w:p>
+    <w:p>
+      <w:pPr>
+        <w:spacing w:after="0" w:line="240" w:lineRule="auto"/>
+      </w:pPr>
+      <w:r>
+        <w:rPr>
+          <w:rFonts w:ascii="Consolas" w:hAnsi="Consolas"/>
+          <w:color w:val="141A22"/>
+          <w:sz w:val="17"/>
+        </w:rPr>
+        <w:t xml:space="preserve">  - Never let a marked-up value into a cash column, a cumulative total or an</w:t>
+      </w:r>
+    </w:p>
+    <w:p>
+      <w:pPr>
+        <w:spacing w:after="0" w:line="240" w:lineRule="auto"/>
+      </w:pPr>
+      <w:r>
+        <w:rPr>
+          <w:rFonts w:ascii="Consolas" w:hAnsi="Consolas"/>
+          <w:color w:val="141A22"/>
+          <w:sz w:val="17"/>
+        </w:rPr>
+        <w:t xml:space="preserve">  IRR.</w:t>
+      </w:r>
+    </w:p>
+    <w:p>
+      <w:pPr>
+        <w:spacing w:after="0" w:line="240" w:lineRule="auto"/>
+      </w:pPr>
+      <w:r>
+        <w:rPr>
+          <w:rFonts w:ascii="Consolas" w:hAnsi="Consolas"/>
+          <w:color w:val="141A22"/>
+          <w:sz w:val="17"/>
+        </w:rPr>
+        <w:t xml:space="preserve">  - Never read a percentage typed as text as a whole number, and never read a</w:t>
+      </w:r>
+    </w:p>
+    <w:p>
+      <w:pPr>
+        <w:spacing w:after="0" w:line="240" w:lineRule="auto"/>
+      </w:pPr>
+      <w:r>
+        <w:rPr>
+          <w:rFonts w:ascii="Consolas" w:hAnsi="Consolas"/>
+          <w:color w:val="141A22"/>
+          <w:sz w:val="17"/>
+        </w:rPr>
+        <w:t xml:space="preserve">  column</w:t>
+      </w:r>
+    </w:p>
+    <w:p>
+      <w:pPr>
+        <w:spacing w:after="0" w:line="240" w:lineRule="auto"/>
+      </w:pPr>
+      <w:r>
+        <w:rPr>
+          <w:rFonts w:ascii="Consolas" w:hAnsi="Consolas"/>
+          <w:color w:val="141A22"/>
+          <w:sz w:val="17"/>
+        </w:rPr>
+        <w:t xml:space="preserve">    headed "Funded year" as an amount. Echo your column mapping before</w:t>
+      </w:r>
+    </w:p>
+    <w:p>
+      <w:pPr>
+        <w:spacing w:after="0" w:line="240" w:lineRule="auto"/>
+      </w:pPr>
+      <w:r>
+        <w:rPr>
+          <w:rFonts w:ascii="Consolas" w:hAnsi="Consolas"/>
+          <w:color w:val="141A22"/>
+          <w:sz w:val="17"/>
+        </w:rPr>
+        <w:t xml:space="preserve">    computing.</w:t>
       </w:r>
     </w:p>
     <w:p>

</xml_diff>